<commit_message>
Added first version UIs for all menus and tables (minus logins and login tables)
</commit_message>
<xml_diff>
--- a/12TPI Project/12TPI Project Write-Up.docx
+++ b/12TPI Project/12TPI Project Write-Up.docx
@@ -3512,6 +3512,30 @@
     </w:p>
     <w:p>
       <w:pPr>
+        <w:spacing w:before="100" w:beforeAutospacing="1" w:after="100" w:afterAutospacing="1" w:line="240" w:lineRule="auto"/>
+        <w:rPr>
+          <w:rFonts w:eastAsia="Times New Roman" w:cstheme="minorHAnsi"/>
+          <w:color w:val="2F5496" w:themeColor="accent1" w:themeShade="BF"/>
+          <w:sz w:val="24"/>
+          <w:szCs w:val="24"/>
+          <w:lang w:val="en-NZ" w:eastAsia="en-NZ"/>
+        </w:rPr>
+      </w:pPr>
+    </w:p>
+    <w:p>
+      <w:pPr>
+        <w:spacing w:before="100" w:beforeAutospacing="1" w:after="100" w:afterAutospacing="1" w:line="240" w:lineRule="auto"/>
+        <w:rPr>
+          <w:rFonts w:eastAsia="Times New Roman" w:cstheme="minorHAnsi"/>
+          <w:color w:val="2F5496" w:themeColor="accent1" w:themeShade="BF"/>
+          <w:sz w:val="24"/>
+          <w:szCs w:val="24"/>
+          <w:lang w:val="en-NZ" w:eastAsia="en-NZ"/>
+        </w:rPr>
+      </w:pPr>
+    </w:p>
+    <w:p>
+      <w:pPr>
         <w:pStyle w:val="Heading1"/>
         <w:rPr>
           <w:rFonts w:ascii="Arial Narrow" w:eastAsia="Times New Roman" w:hAnsi="Arial Narrow" w:cs="Segoe UI"/>
@@ -3569,6 +3593,19 @@
     </w:p>
     <w:p>
       <w:pPr>
+        <w:rPr>
+          <w:lang w:val="en-NZ" w:eastAsia="en-NZ"/>
+        </w:rPr>
+      </w:pPr>
+      <w:r>
+        <w:rPr>
+          <w:lang w:val="en-NZ" w:eastAsia="en-NZ"/>
+        </w:rPr>
+        <w:t>V1</w:t>
+      </w:r>
+    </w:p>
+    <w:p>
+      <w:pPr>
         <w:spacing w:before="100" w:beforeAutospacing="1" w:after="100" w:afterAutospacing="1" w:line="240" w:lineRule="auto"/>
         <w:rPr>
           <w:rFonts w:eastAsia="Times New Roman" w:cstheme="minorHAnsi"/>
@@ -3588,16 +3625,16 @@
           <w:lang w:val="en-NZ" w:eastAsia="en-NZ"/>
         </w:rPr>
         <w:drawing>
-          <wp:anchor distT="0" distB="0" distL="114300" distR="114300" simplePos="0" relativeHeight="251658240" behindDoc="0" locked="0" layoutInCell="1" allowOverlap="1" wp14:anchorId="4F2DC36B" wp14:editId="587965BE">
+          <wp:anchor distT="0" distB="0" distL="114300" distR="114300" simplePos="0" relativeHeight="251658240" behindDoc="0" locked="0" layoutInCell="1" allowOverlap="1" wp14:anchorId="4F2DC36B" wp14:editId="10708C0C">
             <wp:simplePos x="0" y="0"/>
             <wp:positionH relativeFrom="column">
-              <wp:posOffset>2374901</wp:posOffset>
+              <wp:posOffset>2374900</wp:posOffset>
             </wp:positionH>
             <wp:positionV relativeFrom="paragraph">
-              <wp:posOffset>182519</wp:posOffset>
+              <wp:posOffset>67310</wp:posOffset>
             </wp:positionV>
-            <wp:extent cx="2286000" cy="3234416"/>
-            <wp:effectExtent l="0" t="0" r="0" b="4445"/>
+            <wp:extent cx="2294212" cy="3246035"/>
+            <wp:effectExtent l="0" t="0" r="0" b="0"/>
             <wp:wrapNone/>
             <wp:docPr id="1661323426" name="Picture 2"/>
             <wp:cNvGraphicFramePr>
@@ -3625,7 +3662,7 @@
                   <pic:spPr>
                     <a:xfrm>
                       <a:off x="0" y="0"/>
-                      <a:ext cx="2292692" cy="3243884"/>
+                      <a:ext cx="2309131" cy="3267143"/>
                     </a:xfrm>
                     <a:prstGeom prst="rect">
                       <a:avLst/>
@@ -3697,6 +3734,20 @@
     </w:p>
     <w:p>
       <w:pPr>
+        <w:rPr>
+          <w:lang w:val="en-NZ" w:eastAsia="en-NZ"/>
+        </w:rPr>
+      </w:pPr>
+      <w:bookmarkStart w:id="12" w:name="_Toc141881219"/>
+      <w:r>
+        <w:rPr>
+          <w:lang w:val="en-NZ" w:eastAsia="en-NZ"/>
+        </w:rPr>
+        <w:t>V2</w:t>
+      </w:r>
+    </w:p>
+    <w:p>
+      <w:pPr>
         <w:pStyle w:val="Heading2"/>
         <w:rPr>
           <w:rFonts w:asciiTheme="minorHAnsi" w:hAnsiTheme="minorHAnsi" w:cstheme="minorHAnsi"/>
@@ -3706,8 +3757,10 @@
           <w:szCs w:val="28"/>
         </w:rPr>
       </w:pPr>
-      <w:bookmarkStart w:id="12" w:name="_Toc141881219"/>
-      <w:r>
+    </w:p>
+    <w:p>
+      <w:pPr>
+        <w:pStyle w:val="Heading2"/>
         <w:rPr>
           <w:rFonts w:asciiTheme="minorHAnsi" w:hAnsiTheme="minorHAnsi" w:cstheme="minorHAnsi"/>
           <w:b/>
@@ -3715,6 +3768,173 @@
           <w:sz w:val="28"/>
           <w:szCs w:val="28"/>
         </w:rPr>
+      </w:pPr>
+    </w:p>
+    <w:p>
+      <w:pPr>
+        <w:pStyle w:val="Heading2"/>
+        <w:rPr>
+          <w:rFonts w:asciiTheme="minorHAnsi" w:hAnsiTheme="minorHAnsi" w:cstheme="minorHAnsi"/>
+          <w:b/>
+          <w:bCs/>
+          <w:sz w:val="28"/>
+          <w:szCs w:val="28"/>
+        </w:rPr>
+      </w:pPr>
+    </w:p>
+    <w:p>
+      <w:pPr>
+        <w:pStyle w:val="Heading2"/>
+        <w:rPr>
+          <w:rFonts w:asciiTheme="minorHAnsi" w:hAnsiTheme="minorHAnsi" w:cstheme="minorHAnsi"/>
+          <w:b/>
+          <w:bCs/>
+          <w:sz w:val="28"/>
+          <w:szCs w:val="28"/>
+        </w:rPr>
+      </w:pPr>
+    </w:p>
+    <w:p>
+      <w:pPr>
+        <w:pStyle w:val="Heading2"/>
+        <w:rPr>
+          <w:rFonts w:asciiTheme="minorHAnsi" w:hAnsiTheme="minorHAnsi" w:cstheme="minorHAnsi"/>
+          <w:b/>
+          <w:bCs/>
+          <w:sz w:val="28"/>
+          <w:szCs w:val="28"/>
+        </w:rPr>
+      </w:pPr>
+    </w:p>
+    <w:p>
+      <w:pPr>
+        <w:pStyle w:val="Heading2"/>
+        <w:rPr>
+          <w:rFonts w:asciiTheme="minorHAnsi" w:hAnsiTheme="minorHAnsi" w:cstheme="minorHAnsi"/>
+          <w:b/>
+          <w:bCs/>
+          <w:sz w:val="28"/>
+          <w:szCs w:val="28"/>
+        </w:rPr>
+      </w:pPr>
+    </w:p>
+    <w:p>
+      <w:pPr>
+        <w:pStyle w:val="Heading2"/>
+        <w:rPr>
+          <w:rFonts w:asciiTheme="minorHAnsi" w:hAnsiTheme="minorHAnsi" w:cstheme="minorHAnsi"/>
+          <w:b/>
+          <w:bCs/>
+          <w:sz w:val="28"/>
+          <w:szCs w:val="28"/>
+        </w:rPr>
+      </w:pPr>
+    </w:p>
+    <w:p>
+      <w:pPr>
+        <w:pStyle w:val="Heading2"/>
+        <w:rPr>
+          <w:rFonts w:asciiTheme="minorHAnsi" w:hAnsiTheme="minorHAnsi" w:cstheme="minorHAnsi"/>
+          <w:b/>
+          <w:bCs/>
+          <w:sz w:val="28"/>
+          <w:szCs w:val="28"/>
+        </w:rPr>
+      </w:pPr>
+    </w:p>
+    <w:p>
+      <w:pPr>
+        <w:pStyle w:val="Heading2"/>
+        <w:rPr>
+          <w:rFonts w:asciiTheme="minorHAnsi" w:hAnsiTheme="minorHAnsi" w:cstheme="minorHAnsi"/>
+          <w:b/>
+          <w:bCs/>
+          <w:sz w:val="28"/>
+          <w:szCs w:val="28"/>
+        </w:rPr>
+      </w:pPr>
+    </w:p>
+    <w:p>
+      <w:pPr>
+        <w:pStyle w:val="Heading2"/>
+        <w:rPr>
+          <w:rFonts w:asciiTheme="minorHAnsi" w:hAnsiTheme="minorHAnsi" w:cstheme="minorHAnsi"/>
+          <w:b/>
+          <w:bCs/>
+          <w:sz w:val="28"/>
+          <w:szCs w:val="28"/>
+        </w:rPr>
+      </w:pPr>
+    </w:p>
+    <w:p>
+      <w:pPr>
+        <w:pStyle w:val="Heading2"/>
+        <w:rPr>
+          <w:rFonts w:asciiTheme="minorHAnsi" w:hAnsiTheme="minorHAnsi" w:cstheme="minorHAnsi"/>
+          <w:b/>
+          <w:bCs/>
+          <w:sz w:val="28"/>
+          <w:szCs w:val="28"/>
+        </w:rPr>
+      </w:pPr>
+    </w:p>
+    <w:p>
+      <w:pPr>
+        <w:pStyle w:val="Heading2"/>
+        <w:rPr>
+          <w:rFonts w:asciiTheme="minorHAnsi" w:hAnsiTheme="minorHAnsi" w:cstheme="minorHAnsi"/>
+          <w:b/>
+          <w:bCs/>
+          <w:sz w:val="28"/>
+          <w:szCs w:val="28"/>
+        </w:rPr>
+      </w:pPr>
+    </w:p>
+    <w:p>
+      <w:pPr>
+        <w:pStyle w:val="Heading2"/>
+        <w:rPr>
+          <w:rFonts w:asciiTheme="minorHAnsi" w:hAnsiTheme="minorHAnsi" w:cstheme="minorHAnsi"/>
+          <w:b/>
+          <w:bCs/>
+          <w:sz w:val="28"/>
+          <w:szCs w:val="28"/>
+        </w:rPr>
+      </w:pPr>
+    </w:p>
+    <w:p>
+      <w:pPr>
+        <w:pStyle w:val="Heading2"/>
+        <w:rPr>
+          <w:rFonts w:asciiTheme="minorHAnsi" w:hAnsiTheme="minorHAnsi" w:cstheme="minorHAnsi"/>
+          <w:b/>
+          <w:bCs/>
+          <w:sz w:val="28"/>
+          <w:szCs w:val="28"/>
+        </w:rPr>
+      </w:pPr>
+    </w:p>
+    <w:p/>
+    <w:p>
+      <w:pPr>
+        <w:pStyle w:val="Heading2"/>
+        <w:rPr>
+          <w:rFonts w:asciiTheme="minorHAnsi" w:hAnsiTheme="minorHAnsi" w:cstheme="minorHAnsi"/>
+          <w:b/>
+          <w:bCs/>
+          <w:sz w:val="28"/>
+          <w:szCs w:val="28"/>
+        </w:rPr>
+      </w:pPr>
+      <w:r>
+        <w:rPr>
+          <w:rFonts w:asciiTheme="minorHAnsi" w:hAnsiTheme="minorHAnsi" w:cstheme="minorHAnsi"/>
+          <w:b/>
+          <w:bCs/>
+          <w:sz w:val="28"/>
+          <w:szCs w:val="28"/>
+        </w:rPr>
+        <w:lastRenderedPageBreak/>
         <w:t>Flowcharts/Pseudocodes</w:t>
       </w:r>
       <w:bookmarkEnd w:id="12"/>
@@ -3722,6 +3942,11 @@
     <w:p>
       <w:r>
         <w:t>Landing Screen</w:t>
+      </w:r>
+    </w:p>
+    <w:p>
+      <w:r>
+        <w:t>V1</w:t>
       </w:r>
     </w:p>
     <w:p>
@@ -3745,9 +3970,9 @@
           <w:lang w:val="en-NZ" w:eastAsia="en-NZ"/>
         </w:rPr>
         <w:drawing>
-          <wp:inline distT="0" distB="0" distL="0" distR="0" wp14:anchorId="56B58891" wp14:editId="6FAB3542">
-            <wp:extent cx="1642185" cy="3930650"/>
-            <wp:effectExtent l="0" t="0" r="0" b="635"/>
+          <wp:inline distT="0" distB="0" distL="0" distR="0" wp14:anchorId="56B58891" wp14:editId="57968C06">
+            <wp:extent cx="3213100" cy="7690710"/>
+            <wp:effectExtent l="0" t="0" r="6350" b="5715"/>
             <wp:docPr id="264409217" name="Picture 1"/>
             <wp:cNvGraphicFramePr>
               <a:graphicFrameLocks xmlns:a="http://schemas.openxmlformats.org/drawingml/2006/main" noChangeAspect="1"/>
@@ -3774,7 +3999,7 @@
                   <pic:spPr>
                     <a:xfrm>
                       <a:off x="0" y="0"/>
-                      <a:ext cx="1642185" cy="3930650"/>
+                      <a:ext cx="3253027" cy="7786277"/>
                     </a:xfrm>
                     <a:prstGeom prst="rect">
                       <a:avLst/>
@@ -3790,41 +4015,20 @@
     <w:p>
       <w:r>
         <w:lastRenderedPageBreak/>
-        <w:t>Admin</w:t>
-      </w:r>
-      <w:r>
-        <w:t xml:space="preserve"> </w:t>
-      </w:r>
-      <w:r>
-        <w:t>Login</w:t>
-      </w:r>
-    </w:p>
-    <w:p>
-      <w:pPr>
-        <w:pStyle w:val="Heading2"/>
-        <w:rPr>
-          <w:rFonts w:asciiTheme="minorHAnsi" w:hAnsiTheme="minorHAnsi" w:cstheme="minorHAnsi"/>
-          <w:b/>
-          <w:bCs/>
-          <w:sz w:val="28"/>
-          <w:szCs w:val="28"/>
-        </w:rPr>
-      </w:pPr>
-      <w:bookmarkStart w:id="13" w:name="_Toc141881220"/>
-      <w:r>
-        <w:rPr>
-          <w:rFonts w:asciiTheme="minorHAnsi" w:hAnsiTheme="minorHAnsi" w:cstheme="minorHAnsi"/>
-          <w:b/>
-          <w:bCs/>
+        <w:t>V2</w:t>
+      </w:r>
+      <w:r>
+        <w:br/>
+      </w:r>
+      <w:r>
+        <w:rPr>
           <w:noProof/>
-          <w:sz w:val="28"/>
-          <w:szCs w:val="28"/>
         </w:rPr>
         <w:drawing>
-          <wp:inline distT="0" distB="0" distL="0" distR="0" wp14:anchorId="6AEC79CC" wp14:editId="47F8EE38">
-            <wp:extent cx="4216400" cy="4088404"/>
-            <wp:effectExtent l="0" t="0" r="0" b="7620"/>
-            <wp:docPr id="1260699537" name="Picture 3"/>
+          <wp:inline distT="0" distB="0" distL="0" distR="0" wp14:anchorId="15840995" wp14:editId="2A6F1C38">
+            <wp:extent cx="2546350" cy="8645578"/>
+            <wp:effectExtent l="0" t="0" r="6350" b="3175"/>
+            <wp:docPr id="1862248059" name="Picture 1"/>
             <wp:cNvGraphicFramePr>
               <a:graphicFrameLocks xmlns:a="http://schemas.openxmlformats.org/drawingml/2006/main" noChangeAspect="1"/>
             </wp:cNvGraphicFramePr>
@@ -3832,7 +4036,7 @@
               <a:graphicData uri="http://schemas.openxmlformats.org/drawingml/2006/picture">
                 <pic:pic xmlns:pic="http://schemas.openxmlformats.org/drawingml/2006/picture">
                   <pic:nvPicPr>
-                    <pic:cNvPr id="1260699537" name="Picture 1260699537"/>
+                    <pic:cNvPr id="1862248059" name="Picture 1862248059"/>
                     <pic:cNvPicPr/>
                   </pic:nvPicPr>
                   <pic:blipFill>
@@ -3850,7 +4054,7 @@
                   <pic:spPr>
                     <a:xfrm>
                       <a:off x="0" y="0"/>
-                      <a:ext cx="4223163" cy="4094961"/>
+                      <a:ext cx="2616551" cy="8883929"/>
                     </a:xfrm>
                     <a:prstGeom prst="rect">
                       <a:avLst/>
@@ -3863,12 +4067,19 @@
         </w:drawing>
       </w:r>
     </w:p>
-    <w:p>
-      <w:r>
-        <w:t>Manager Login</w:t>
-      </w:r>
-    </w:p>
     <w:p/>
+    <w:p/>
+    <w:p>
+      <w:r>
+        <w:t>Admin</w:t>
+      </w:r>
+      <w:r>
+        <w:t xml:space="preserve"> </w:t>
+      </w:r>
+      <w:r>
+        <w:t>Login</w:t>
+      </w:r>
+    </w:p>
     <w:p>
       <w:pPr>
         <w:pStyle w:val="Heading2"/>
@@ -3880,7 +4091,240 @@
           <w:szCs w:val="28"/>
         </w:rPr>
       </w:pPr>
-      <w:r>
+      <w:bookmarkStart w:id="13" w:name="_Toc141881220"/>
+      <w:r>
+        <w:rPr>
+          <w:rFonts w:asciiTheme="minorHAnsi" w:hAnsiTheme="minorHAnsi" w:cstheme="minorHAnsi"/>
+          <w:b/>
+          <w:bCs/>
+          <w:noProof/>
+          <w:sz w:val="28"/>
+          <w:szCs w:val="28"/>
+        </w:rPr>
+        <w:drawing>
+          <wp:inline distT="0" distB="0" distL="0" distR="0" wp14:anchorId="6AEC79CC" wp14:editId="4F45FF55">
+            <wp:extent cx="3708400" cy="3595824"/>
+            <wp:effectExtent l="0" t="0" r="6350" b="5080"/>
+            <wp:docPr id="1260699537" name="Picture 3"/>
+            <wp:cNvGraphicFramePr>
+              <a:graphicFrameLocks xmlns:a="http://schemas.openxmlformats.org/drawingml/2006/main" noChangeAspect="1"/>
+            </wp:cNvGraphicFramePr>
+            <a:graphic xmlns:a="http://schemas.openxmlformats.org/drawingml/2006/main">
+              <a:graphicData uri="http://schemas.openxmlformats.org/drawingml/2006/picture">
+                <pic:pic xmlns:pic="http://schemas.openxmlformats.org/drawingml/2006/picture">
+                  <pic:nvPicPr>
+                    <pic:cNvPr id="1260699537" name="Picture 1260699537"/>
+                    <pic:cNvPicPr/>
+                  </pic:nvPicPr>
+                  <pic:blipFill>
+                    <a:blip r:embed="rId19">
+                      <a:extLst>
+                        <a:ext uri="{28A0092B-C50C-407E-A947-70E740481C1C}">
+                          <a14:useLocalDpi xmlns:a14="http://schemas.microsoft.com/office/drawing/2010/main" val="0"/>
+                        </a:ext>
+                      </a:extLst>
+                    </a:blip>
+                    <a:stretch>
+                      <a:fillRect/>
+                    </a:stretch>
+                  </pic:blipFill>
+                  <pic:spPr>
+                    <a:xfrm>
+                      <a:off x="0" y="0"/>
+                      <a:ext cx="3720004" cy="3607075"/>
+                    </a:xfrm>
+                    <a:prstGeom prst="rect">
+                      <a:avLst/>
+                    </a:prstGeom>
+                  </pic:spPr>
+                </pic:pic>
+              </a:graphicData>
+            </a:graphic>
+          </wp:inline>
+        </w:drawing>
+      </w:r>
+    </w:p>
+    <w:p>
+      <w:r>
+        <w:t>Manager Login</w:t>
+      </w:r>
+    </w:p>
+    <w:p>
+      <w:r>
+        <w:rPr>
+          <w:noProof/>
+        </w:rPr>
+        <w:drawing>
+          <wp:inline distT="0" distB="0" distL="0" distR="0" wp14:anchorId="01AE1D20" wp14:editId="35BF784D">
+            <wp:extent cx="3744928" cy="3625850"/>
+            <wp:effectExtent l="0" t="0" r="8255" b="0"/>
+            <wp:docPr id="1703992689" name="Picture 4"/>
+            <wp:cNvGraphicFramePr>
+              <a:graphicFrameLocks xmlns:a="http://schemas.openxmlformats.org/drawingml/2006/main" noChangeAspect="1"/>
+            </wp:cNvGraphicFramePr>
+            <a:graphic xmlns:a="http://schemas.openxmlformats.org/drawingml/2006/main">
+              <a:graphicData uri="http://schemas.openxmlformats.org/drawingml/2006/picture">
+                <pic:pic xmlns:pic="http://schemas.openxmlformats.org/drawingml/2006/picture">
+                  <pic:nvPicPr>
+                    <pic:cNvPr id="1703992689" name="Picture 1703992689"/>
+                    <pic:cNvPicPr/>
+                  </pic:nvPicPr>
+                  <pic:blipFill>
+                    <a:blip r:embed="rId20">
+                      <a:extLst>
+                        <a:ext uri="{28A0092B-C50C-407E-A947-70E740481C1C}">
+                          <a14:useLocalDpi xmlns:a14="http://schemas.microsoft.com/office/drawing/2010/main" val="0"/>
+                        </a:ext>
+                      </a:extLst>
+                    </a:blip>
+                    <a:stretch>
+                      <a:fillRect/>
+                    </a:stretch>
+                  </pic:blipFill>
+                  <pic:spPr>
+                    <a:xfrm>
+                      <a:off x="0" y="0"/>
+                      <a:ext cx="3759207" cy="3639675"/>
+                    </a:xfrm>
+                    <a:prstGeom prst="rect">
+                      <a:avLst/>
+                    </a:prstGeom>
+                  </pic:spPr>
+                </pic:pic>
+              </a:graphicData>
+            </a:graphic>
+          </wp:inline>
+        </w:drawing>
+      </w:r>
+    </w:p>
+    <w:p/>
+    <w:p/>
+    <w:p/>
+    <w:p>
+      <w:r>
+        <w:t>Customer Login</w:t>
+      </w:r>
+    </w:p>
+    <w:p>
+      <w:r>
+        <w:rPr>
+          <w:noProof/>
+        </w:rPr>
+        <w:drawing>
+          <wp:inline distT="0" distB="0" distL="0" distR="0" wp14:anchorId="474778CC" wp14:editId="4874E6D7">
+            <wp:extent cx="3536950" cy="4554346"/>
+            <wp:effectExtent l="0" t="0" r="6350" b="0"/>
+            <wp:docPr id="627920586" name="Picture 6"/>
+            <wp:cNvGraphicFramePr>
+              <a:graphicFrameLocks xmlns:a="http://schemas.openxmlformats.org/drawingml/2006/main" noChangeAspect="1"/>
+            </wp:cNvGraphicFramePr>
+            <a:graphic xmlns:a="http://schemas.openxmlformats.org/drawingml/2006/main">
+              <a:graphicData uri="http://schemas.openxmlformats.org/drawingml/2006/picture">
+                <pic:pic xmlns:pic="http://schemas.openxmlformats.org/drawingml/2006/picture">
+                  <pic:nvPicPr>
+                    <pic:cNvPr id="627920586" name="Picture 627920586"/>
+                    <pic:cNvPicPr/>
+                  </pic:nvPicPr>
+                  <pic:blipFill>
+                    <a:blip r:embed="rId21">
+                      <a:extLst>
+                        <a:ext uri="{28A0092B-C50C-407E-A947-70E740481C1C}">
+                          <a14:useLocalDpi xmlns:a14="http://schemas.microsoft.com/office/drawing/2010/main" val="0"/>
+                        </a:ext>
+                      </a:extLst>
+                    </a:blip>
+                    <a:stretch>
+                      <a:fillRect/>
+                    </a:stretch>
+                  </pic:blipFill>
+                  <pic:spPr>
+                    <a:xfrm>
+                      <a:off x="0" y="0"/>
+                      <a:ext cx="3546230" cy="4566295"/>
+                    </a:xfrm>
+                    <a:prstGeom prst="rect">
+                      <a:avLst/>
+                    </a:prstGeom>
+                  </pic:spPr>
+                </pic:pic>
+              </a:graphicData>
+            </a:graphic>
+          </wp:inline>
+        </w:drawing>
+      </w:r>
+      <w:r>
+        <w:t xml:space="preserve"> </w:t>
+      </w:r>
+    </w:p>
+    <w:p/>
+    <w:p/>
+    <w:p/>
+    <w:p/>
+    <w:p/>
+    <w:p/>
+    <w:p/>
+    <w:p/>
+    <w:p/>
+    <w:p/>
+    <w:p/>
+    <w:p/>
+    <w:p>
+      <w:r>
+        <w:lastRenderedPageBreak/>
+        <w:t>General View</w:t>
+      </w:r>
+    </w:p>
+    <w:p>
+      <w:r>
+        <w:rPr>
+          <w:noProof/>
+        </w:rPr>
+        <w:drawing>
+          <wp:inline distT="0" distB="0" distL="0" distR="0" wp14:anchorId="51AB5C8A" wp14:editId="17BAF878">
+            <wp:extent cx="2724150" cy="8105775"/>
+            <wp:effectExtent l="0" t="0" r="0" b="9525"/>
+            <wp:docPr id="786629761" name="Picture 2"/>
+            <wp:cNvGraphicFramePr>
+              <a:graphicFrameLocks xmlns:a="http://schemas.openxmlformats.org/drawingml/2006/main" noChangeAspect="1"/>
+            </wp:cNvGraphicFramePr>
+            <a:graphic xmlns:a="http://schemas.openxmlformats.org/drawingml/2006/main">
+              <a:graphicData uri="http://schemas.openxmlformats.org/drawingml/2006/picture">
+                <pic:pic xmlns:pic="http://schemas.openxmlformats.org/drawingml/2006/picture">
+                  <pic:nvPicPr>
+                    <pic:cNvPr id="786629761" name="Picture 786629761"/>
+                    <pic:cNvPicPr/>
+                  </pic:nvPicPr>
+                  <pic:blipFill>
+                    <a:blip r:embed="rId22">
+                      <a:extLst>
+                        <a:ext uri="{28A0092B-C50C-407E-A947-70E740481C1C}">
+                          <a14:useLocalDpi xmlns:a14="http://schemas.microsoft.com/office/drawing/2010/main" val="0"/>
+                        </a:ext>
+                      </a:extLst>
+                    </a:blip>
+                    <a:stretch>
+                      <a:fillRect/>
+                    </a:stretch>
+                  </pic:blipFill>
+                  <pic:spPr>
+                    <a:xfrm>
+                      <a:off x="0" y="0"/>
+                      <a:ext cx="2724150" cy="8105775"/>
+                    </a:xfrm>
+                    <a:prstGeom prst="rect">
+                      <a:avLst/>
+                    </a:prstGeom>
+                  </pic:spPr>
+                </pic:pic>
+              </a:graphicData>
+            </a:graphic>
+          </wp:inline>
+        </w:drawing>
+      </w:r>
+    </w:p>
+    <w:p>
+      <w:pPr>
+        <w:pStyle w:val="Heading2"/>
         <w:rPr>
           <w:rFonts w:asciiTheme="minorHAnsi" w:hAnsiTheme="minorHAnsi" w:cstheme="minorHAnsi"/>
           <w:b/>
@@ -3888,6 +4332,16 @@
           <w:sz w:val="28"/>
           <w:szCs w:val="28"/>
         </w:rPr>
+      </w:pPr>
+      <w:r>
+        <w:rPr>
+          <w:rFonts w:asciiTheme="minorHAnsi" w:hAnsiTheme="minorHAnsi" w:cstheme="minorHAnsi"/>
+          <w:b/>
+          <w:bCs/>
+          <w:sz w:val="28"/>
+          <w:szCs w:val="28"/>
+        </w:rPr>
+        <w:lastRenderedPageBreak/>
         <w:t>Use case diagram</w:t>
       </w:r>
       <w:bookmarkEnd w:id="13"/>
@@ -4068,7 +4522,7 @@
                     <pic:cNvPicPr/>
                   </pic:nvPicPr>
                   <pic:blipFill>
-                    <a:blip r:embed="rId19">
+                    <a:blip r:embed="rId23">
                       <a:extLst>
                         <a:ext uri="{28A0092B-C50C-407E-A947-70E740481C1C}">
                           <a14:useLocalDpi xmlns:a14="http://schemas.microsoft.com/office/drawing/2010/main" val="0"/>
@@ -6680,6 +7134,10 @@
 </file>
 
 <file path=customXml/item1.xml><?xml version="1.0" encoding="utf-8"?>
+<b:Sources xmlns:b="http://schemas.openxmlformats.org/officeDocument/2006/bibliography" xmlns="http://schemas.openxmlformats.org/officeDocument/2006/bibliography" SelectedStyle="\APASixthEditionOfficeOnline.xsl" StyleName="APA" Version="6"/>
+</file>
+
+<file path=customXml/item2.xml><?xml version="1.0" encoding="utf-8"?>
 <ct:contentTypeSchema xmlns:ct="http://schemas.microsoft.com/office/2006/metadata/contentType" xmlns:ma="http://schemas.microsoft.com/office/2006/metadata/properties/metaAttributes" ct:_="" ma:_="" ma:contentTypeName="Document" ma:contentTypeID="0x010100996EDD3AF3B48C4BB8C711B5733C39F6" ma:contentTypeVersion="8" ma:contentTypeDescription="Create a new document." ma:contentTypeScope="" ma:versionID="7877da1482023c7e2a024716cc794e3c">
   <xsd:schema xmlns:xsd="http://www.w3.org/2001/XMLSchema" xmlns:xs="http://www.w3.org/2001/XMLSchema" xmlns:p="http://schemas.microsoft.com/office/2006/metadata/properties" xmlns:ns2="eef22584-95ed-477f-8b51-08e32d23c53e" targetNamespace="http://schemas.microsoft.com/office/2006/metadata/properties" ma:root="true" ma:fieldsID="517bd48a1ce1592919b2d7c36f8fb3bc" ns2:_="">
     <xsd:import namespace="eef22584-95ed-477f-8b51-08e32d23c53e"/>
@@ -6847,7 +7305,7 @@
 </ct:contentTypeSchema>
 </file>
 
-<file path=customXml/item2.xml><?xml version="1.0" encoding="utf-8"?>
+<file path=customXml/item3.xml><?xml version="1.0" encoding="utf-8"?>
 <?mso-contentType ?>
 <FormTemplates xmlns="http://schemas.microsoft.com/sharepoint/v3/contenttype/forms">
   <Display>DocumentLibraryForm</Display>
@@ -6856,7 +7314,7 @@
 </FormTemplates>
 </file>
 
-<file path=customXml/item3.xml><?xml version="1.0" encoding="utf-8"?>
+<file path=customXml/item4.xml><?xml version="1.0" encoding="utf-8"?>
 <p:properties xmlns:p="http://schemas.microsoft.com/office/2006/metadata/properties" xmlns:xsi="http://www.w3.org/2001/XMLSchema-instance" xmlns:pc="http://schemas.microsoft.com/office/infopath/2007/PartnerControls">
   <documentManagement>
     <ReferenceId xmlns="eef22584-95ed-477f-8b51-08e32d23c53e" xsi:nil="true"/>
@@ -6864,11 +7322,15 @@
 </p:properties>
 </file>
 
-<file path=customXml/item4.xml><?xml version="1.0" encoding="utf-8"?>
-<b:Sources xmlns:b="http://schemas.openxmlformats.org/officeDocument/2006/bibliography" xmlns="http://schemas.openxmlformats.org/officeDocument/2006/bibliography" SelectedStyle="\APASixthEditionOfficeOnline.xsl" StyleName="APA" Version="6"/>
+<file path=customXml/itemProps1.xml><?xml version="1.0" encoding="utf-8"?>
+<ds:datastoreItem xmlns:ds="http://schemas.openxmlformats.org/officeDocument/2006/customXml" ds:itemID="{B9F390CF-A74E-4EB5-BD54-ED10285954D8}">
+  <ds:schemaRefs>
+    <ds:schemaRef ds:uri="http://schemas.openxmlformats.org/officeDocument/2006/bibliography"/>
+  </ds:schemaRefs>
+</ds:datastoreItem>
 </file>
 
-<file path=customXml/itemProps1.xml><?xml version="1.0" encoding="utf-8"?>
+<file path=customXml/itemProps2.xml><?xml version="1.0" encoding="utf-8"?>
 <ds:datastoreItem xmlns:ds="http://schemas.openxmlformats.org/officeDocument/2006/customXml" ds:itemID="{975E2EC3-F226-478B-88DA-77A0B44A31C0}">
   <ds:schemaRefs>
     <ds:schemaRef ds:uri="http://schemas.microsoft.com/office/2006/metadata/contentType"/>
@@ -6886,7 +7348,7 @@
 </ds:datastoreItem>
 </file>
 
-<file path=customXml/itemProps2.xml><?xml version="1.0" encoding="utf-8"?>
+<file path=customXml/itemProps3.xml><?xml version="1.0" encoding="utf-8"?>
 <ds:datastoreItem xmlns:ds="http://schemas.openxmlformats.org/officeDocument/2006/customXml" ds:itemID="{80B60E6D-8162-4682-B39F-2AD99E9D2FEB}">
   <ds:schemaRefs>
     <ds:schemaRef ds:uri="http://schemas.microsoft.com/sharepoint/v3/contenttype/forms"/>
@@ -6894,7 +7356,7 @@
 </ds:datastoreItem>
 </file>
 
-<file path=customXml/itemProps3.xml><?xml version="1.0" encoding="utf-8"?>
+<file path=customXml/itemProps4.xml><?xml version="1.0" encoding="utf-8"?>
 <ds:datastoreItem xmlns:ds="http://schemas.openxmlformats.org/officeDocument/2006/customXml" ds:itemID="{475DFC7A-9F3E-4A94-87BF-72BD504B2E67}">
   <ds:schemaRefs>
     <ds:schemaRef ds:uri="http://schemas.microsoft.com/office/2006/metadata/properties"/>
@@ -6902,12 +7364,4 @@
     <ds:schemaRef ds:uri="eef22584-95ed-477f-8b51-08e32d23c53e"/>
   </ds:schemaRefs>
 </ds:datastoreItem>
-</file>
-
-<file path=customXml/itemProps4.xml><?xml version="1.0" encoding="utf-8"?>
-<ds:datastoreItem xmlns:ds="http://schemas.openxmlformats.org/officeDocument/2006/customXml" ds:itemID="{B9F390CF-A74E-4EB5-BD54-ED10285954D8}">
-  <ds:schemaRefs>
-    <ds:schemaRef ds:uri="http://schemas.openxmlformats.org/officeDocument/2006/bibliography"/>
-  </ds:schemaRefs>
-</ds:datastoreItem>
 </file>
</xml_diff>

<commit_message>
Added formating to the tables and queires
</commit_message>
<xml_diff>
--- a/12TPI Project/12TPI Project Write-Up.docx
+++ b/12TPI Project/12TPI Project Write-Up.docx
@@ -1,6 +1,6 @@
 
 <file path=word/document.xml><?xml version="1.0" encoding="utf-8"?>
-<w:document xmlns:wpc="http://schemas.microsoft.com/office/word/2010/wordprocessingCanvas" xmlns:cx="http://schemas.microsoft.com/office/drawing/2014/chartex" xmlns:cx1="http://schemas.microsoft.com/office/drawing/2015/9/8/chartex" xmlns:cx2="http://schemas.microsoft.com/office/drawing/2015/10/21/chartex" xmlns:cx3="http://schemas.microsoft.com/office/drawing/2016/5/9/chartex" xmlns:cx4="http://schemas.microsoft.com/office/drawing/2016/5/10/chartex" xmlns:cx5="http://schemas.microsoft.com/office/drawing/2016/5/11/chartex" xmlns:cx6="http://schemas.microsoft.com/office/drawing/2016/5/12/chartex" xmlns:cx7="http://schemas.microsoft.com/office/drawing/2016/5/13/chartex" xmlns:cx8="http://schemas.microsoft.com/office/drawing/2016/5/14/chartex" xmlns:mc="http://schemas.openxmlformats.org/markup-compatibility/2006" xmlns:aink="http://schemas.microsoft.com/office/drawing/2016/ink" xmlns:am3d="http://schemas.microsoft.com/office/drawing/2017/model3d" xmlns:o="urn:schemas-microsoft-com:office:office" xmlns:oel="http://schemas.microsoft.com/office/2019/extlst" xmlns:r="http://schemas.openxmlformats.org/officeDocument/2006/relationships" xmlns:m="http://schemas.openxmlformats.org/officeDocument/2006/math" xmlns:v="urn:schemas-microsoft-com:vml" xmlns:wp14="http://schemas.microsoft.com/office/word/2010/wordprocessingDrawing" xmlns:wp="http://schemas.openxmlformats.org/drawingml/2006/wordprocessingDrawing" xmlns:w10="urn:schemas-microsoft-com:office:word" xmlns:w="http://schemas.openxmlformats.org/wordprocessingml/2006/main" xmlns:w14="http://schemas.microsoft.com/office/word/2010/wordml" xmlns:w15="http://schemas.microsoft.com/office/word/2012/wordml" xmlns:w16cex="http://schemas.microsoft.com/office/word/2018/wordml/cex" xmlns:w16cid="http://schemas.microsoft.com/office/word/2016/wordml/cid" xmlns:w16="http://schemas.microsoft.com/office/word/2018/wordml" xmlns:w16du="http://schemas.microsoft.com/office/word/2023/wordml/word16du" xmlns:w16sdtdh="http://schemas.microsoft.com/office/word/2020/wordml/sdtdatahash" xmlns:w16sdtfl="http://schemas.microsoft.com/office/word/2024/wordml/sdtformatlock" xmlns:w16se="http://schemas.microsoft.com/office/word/2015/wordml/symex" xmlns:wpg="http://schemas.microsoft.com/office/word/2010/wordprocessingGroup" xmlns:wpi="http://schemas.microsoft.com/office/word/2010/wordprocessingInk" xmlns:wne="http://schemas.microsoft.com/office/word/2006/wordml" xmlns:wps="http://schemas.microsoft.com/office/word/2010/wordprocessingShape" mc:Ignorable="w14 w15 w16se w16cid w16 w16cex w16sdtdh w16sdtfl w16du wp14">
+<w:document xmlns:wpc="http://schemas.microsoft.com/office/word/2010/wordprocessingCanvas" xmlns:cx="http://schemas.microsoft.com/office/drawing/2014/chartex" xmlns:cx1="http://schemas.microsoft.com/office/drawing/2015/9/8/chartex" xmlns:cx2="http://schemas.microsoft.com/office/drawing/2015/10/21/chartex" xmlns:cx3="http://schemas.microsoft.com/office/drawing/2016/5/9/chartex" xmlns:cx4="http://schemas.microsoft.com/office/drawing/2016/5/10/chartex" xmlns:cx5="http://schemas.microsoft.com/office/drawing/2016/5/11/chartex" xmlns:cx6="http://schemas.microsoft.com/office/drawing/2016/5/12/chartex" xmlns:cx7="http://schemas.microsoft.com/office/drawing/2016/5/13/chartex" xmlns:cx8="http://schemas.microsoft.com/office/drawing/2016/5/14/chartex" xmlns:mc="http://schemas.openxmlformats.org/markup-compatibility/2006" xmlns:aink="http://schemas.microsoft.com/office/drawing/2016/ink" xmlns:am3d="http://schemas.microsoft.com/office/drawing/2017/model3d" xmlns:o="urn:schemas-microsoft-com:office:office" xmlns:oel="http://schemas.microsoft.com/office/2019/extlst" xmlns:r="http://schemas.openxmlformats.org/officeDocument/2006/relationships" xmlns:m="http://schemas.openxmlformats.org/officeDocument/2006/math" xmlns:v="urn:schemas-microsoft-com:vml" xmlns:wp14="http://schemas.microsoft.com/office/word/2010/wordprocessingDrawing" xmlns:wp="http://schemas.openxmlformats.org/drawingml/2006/wordprocessingDrawing" xmlns:w10="urn:schemas-microsoft-com:office:word" xmlns:w="http://schemas.openxmlformats.org/wordprocessingml/2006/main" xmlns:w14="http://schemas.microsoft.com/office/word/2010/wordml" xmlns:w15="http://schemas.microsoft.com/office/word/2012/wordml" xmlns:w16cei="http://schemas.microsoft.com/office/word/2026/wordml/cei" xmlns:w16cex="http://schemas.microsoft.com/office/word/2018/wordml/cex" xmlns:w16cid="http://schemas.microsoft.com/office/word/2016/wordml/cid" xmlns:w16="http://schemas.microsoft.com/office/word/2018/wordml" xmlns:w16du="http://schemas.microsoft.com/office/word/2023/wordml/word16du" xmlns:w16sdtdh="http://schemas.microsoft.com/office/word/2020/wordml/sdtdatahash" xmlns:w16sdtfl="http://schemas.microsoft.com/office/word/2024/wordml/sdtformatlock" xmlns:w16se="http://schemas.microsoft.com/office/word/2015/wordml/symex" xmlns:wpg="http://schemas.microsoft.com/office/word/2010/wordprocessingGroup" xmlns:wpi="http://schemas.microsoft.com/office/word/2010/wordprocessingInk" xmlns:wne="http://schemas.microsoft.com/office/word/2006/wordml" xmlns:wps="http://schemas.microsoft.com/office/word/2010/wordprocessingShape" mc:Ignorable="w14 w15 w16se w16cid w16 w16cex w16sdtdh w16sdtfl w16du wp14">
   <w:body>
     <w:p>
       <w:pPr>
@@ -3940,40 +3940,16 @@
       <w:bookmarkEnd w:id="12"/>
     </w:p>
     <w:p>
-      <w:r>
-        <w:t>Landing Screen</w:t>
-      </w:r>
-    </w:p>
-    <w:p>
-      <w:r>
-        <w:t>V1</w:t>
-      </w:r>
-    </w:p>
-    <w:p>
-      <w:pPr>
-        <w:spacing w:before="100" w:beforeAutospacing="1" w:after="100" w:afterAutospacing="1" w:line="240" w:lineRule="auto"/>
-        <w:rPr>
-          <w:rFonts w:ascii="Arial Narrow" w:eastAsia="Times New Roman" w:hAnsi="Arial Narrow" w:cs="Segoe UI"/>
-          <w:color w:val="2F5496" w:themeColor="accent1" w:themeShade="BF"/>
-          <w:sz w:val="24"/>
-          <w:szCs w:val="24"/>
-          <w:lang w:val="en-NZ" w:eastAsia="en-NZ"/>
-        </w:rPr>
-      </w:pPr>
-      <w:r>
-        <w:rPr>
-          <w:rFonts w:ascii="Arial Narrow" w:eastAsia="Times New Roman" w:hAnsi="Arial Narrow" w:cs="Segoe UI"/>
+      <w:bookmarkStart w:id="13" w:name="_Toc141881220"/>
+      <w:r>
+        <w:rPr>
           <w:noProof/>
-          <w:color w:val="2F5496" w:themeColor="accent1" w:themeShade="BF"/>
-          <w:sz w:val="24"/>
-          <w:szCs w:val="24"/>
-          <w:lang w:val="en-NZ" w:eastAsia="en-NZ"/>
         </w:rPr>
         <w:drawing>
-          <wp:inline distT="0" distB="0" distL="0" distR="0" wp14:anchorId="56B58891" wp14:editId="57968C06">
-            <wp:extent cx="3213100" cy="7690710"/>
-            <wp:effectExtent l="0" t="0" r="6350" b="5715"/>
-            <wp:docPr id="264409217" name="Picture 1"/>
+          <wp:inline distT="0" distB="0" distL="0" distR="0" wp14:anchorId="0CA9DBBD" wp14:editId="227ACAC6">
+            <wp:extent cx="6789858" cy="5353050"/>
+            <wp:effectExtent l="0" t="0" r="0" b="0"/>
+            <wp:docPr id="1404683467" name="Picture 1"/>
             <wp:cNvGraphicFramePr>
               <a:graphicFrameLocks xmlns:a="http://schemas.openxmlformats.org/drawingml/2006/main" noChangeAspect="1"/>
             </wp:cNvGraphicFramePr>
@@ -3981,11 +3957,11 @@
               <a:graphicData uri="http://schemas.openxmlformats.org/drawingml/2006/picture">
                 <pic:pic xmlns:pic="http://schemas.openxmlformats.org/drawingml/2006/picture">
                   <pic:nvPicPr>
-                    <pic:cNvPr id="264409217" name="Picture 264409217"/>
+                    <pic:cNvPr id="1404683467" name="Picture 1404683467"/>
                     <pic:cNvPicPr/>
                   </pic:nvPicPr>
                   <pic:blipFill>
-                    <a:blip r:embed="rId17">
+                    <a:blip r:embed="rId17" cstate="print">
                       <a:extLst>
                         <a:ext uri="{28A0092B-C50C-407E-A947-70E740481C1C}">
                           <a14:useLocalDpi xmlns:a14="http://schemas.microsoft.com/office/drawing/2010/main" val="0"/>
@@ -3999,7 +3975,7 @@
                   <pic:spPr>
                     <a:xfrm>
                       <a:off x="0" y="0"/>
-                      <a:ext cx="3253027" cy="7786277"/>
+                      <a:ext cx="6803538" cy="5363835"/>
                     </a:xfrm>
                     <a:prstGeom prst="rect">
                       <a:avLst/>
@@ -4013,22 +3989,45 @@
       </w:r>
     </w:p>
     <w:p>
-      <w:r>
+      <w:pPr>
+        <w:pStyle w:val="Heading2"/>
+        <w:rPr>
+          <w:rFonts w:asciiTheme="minorHAnsi" w:hAnsiTheme="minorHAnsi" w:cstheme="minorHAnsi"/>
+          <w:b/>
+          <w:bCs/>
+          <w:sz w:val="28"/>
+          <w:szCs w:val="28"/>
+        </w:rPr>
+      </w:pPr>
+      <w:r>
+        <w:rPr>
+          <w:rFonts w:asciiTheme="minorHAnsi" w:hAnsiTheme="minorHAnsi" w:cstheme="minorHAnsi"/>
+          <w:b/>
+          <w:bCs/>
+          <w:sz w:val="28"/>
+          <w:szCs w:val="28"/>
+        </w:rPr>
         <w:lastRenderedPageBreak/>
-        <w:t>V2</w:t>
-      </w:r>
-      <w:r>
-        <w:br/>
-      </w:r>
+        <w:t>Use case diagram</w:t>
+      </w:r>
+      <w:bookmarkEnd w:id="13"/>
+    </w:p>
+    <w:p>
+      <w:pPr>
+        <w:rPr>
+          <w:lang w:val="en-NZ" w:eastAsia="en-NZ"/>
+        </w:rPr>
+      </w:pPr>
       <w:r>
         <w:rPr>
           <w:noProof/>
+          <w:lang w:val="en-NZ" w:eastAsia="en-NZ"/>
         </w:rPr>
         <w:drawing>
-          <wp:inline distT="0" distB="0" distL="0" distR="0" wp14:anchorId="15840995" wp14:editId="2A6F1C38">
-            <wp:extent cx="2546350" cy="8645578"/>
-            <wp:effectExtent l="0" t="0" r="6350" b="3175"/>
-            <wp:docPr id="1862248059" name="Picture 1"/>
+          <wp:inline distT="0" distB="0" distL="0" distR="0" wp14:anchorId="38462EA4" wp14:editId="599DA461">
+            <wp:extent cx="2405575" cy="8611697"/>
+            <wp:effectExtent l="0" t="0" r="0" b="0"/>
+            <wp:docPr id="2059765321" name="Picture 3"/>
             <wp:cNvGraphicFramePr>
               <a:graphicFrameLocks xmlns:a="http://schemas.openxmlformats.org/drawingml/2006/main" noChangeAspect="1"/>
             </wp:cNvGraphicFramePr>
@@ -4036,7 +4035,7 @@
               <a:graphicData uri="http://schemas.openxmlformats.org/drawingml/2006/picture">
                 <pic:pic xmlns:pic="http://schemas.openxmlformats.org/drawingml/2006/picture">
                   <pic:nvPicPr>
-                    <pic:cNvPr id="1862248059" name="Picture 1862248059"/>
+                    <pic:cNvPr id="2059765321" name="Picture 2059765321"/>
                     <pic:cNvPicPr/>
                   </pic:nvPicPr>
                   <pic:blipFill>
@@ -4054,7 +4053,7 @@
                   <pic:spPr>
                     <a:xfrm>
                       <a:off x="0" y="0"/>
-                      <a:ext cx="2616551" cy="8883929"/>
+                      <a:ext cx="2439350" cy="8732607"/>
                     </a:xfrm>
                     <a:prstGeom prst="rect">
                       <a:avLst/>
@@ -4067,19 +4066,6 @@
         </w:drawing>
       </w:r>
     </w:p>
-    <w:p/>
-    <w:p/>
-    <w:p>
-      <w:r>
-        <w:t>Admin</w:t>
-      </w:r>
-      <w:r>
-        <w:t xml:space="preserve"> </w:t>
-      </w:r>
-      <w:r>
-        <w:t>Login</w:t>
-      </w:r>
-    </w:p>
     <w:p>
       <w:pPr>
         <w:pStyle w:val="Heading2"/>
@@ -4091,21 +4077,71 @@
           <w:szCs w:val="28"/>
         </w:rPr>
       </w:pPr>
-      <w:bookmarkStart w:id="13" w:name="_Toc141881220"/>
+      <w:bookmarkStart w:id="14" w:name="_Toc141881221"/>
       <w:r>
         <w:rPr>
           <w:rFonts w:asciiTheme="minorHAnsi" w:hAnsiTheme="minorHAnsi" w:cstheme="minorHAnsi"/>
           <w:b/>
           <w:bCs/>
+          <w:sz w:val="28"/>
+          <w:szCs w:val="28"/>
+        </w:rPr>
+        <w:lastRenderedPageBreak/>
+        <w:t>Entity relationship diagram</w:t>
+      </w:r>
+      <w:bookmarkEnd w:id="14"/>
+    </w:p>
+    <w:p>
+      <w:pPr>
+        <w:rPr>
+          <w:sz w:val="28"/>
+          <w:szCs w:val="28"/>
+          <w:lang w:val="en-NZ" w:eastAsia="en-NZ"/>
+        </w:rPr>
+      </w:pPr>
+      <w:r>
+        <w:rPr>
+          <w:sz w:val="28"/>
+          <w:szCs w:val="28"/>
+          <w:lang w:val="en-NZ" w:eastAsia="en-NZ"/>
+        </w:rPr>
+        <w:t xml:space="preserve">Pre-Coding </w:t>
+      </w:r>
+    </w:p>
+    <w:p>
+      <w:pPr>
+        <w:rPr>
+          <w:sz w:val="28"/>
+          <w:szCs w:val="28"/>
+          <w:lang w:val="en-NZ" w:eastAsia="en-NZ"/>
+        </w:rPr>
+      </w:pPr>
+      <w:r>
+        <w:rPr>
+          <w:sz w:val="28"/>
+          <w:szCs w:val="28"/>
+          <w:lang w:val="en-NZ" w:eastAsia="en-NZ"/>
+        </w:rPr>
+        <w:t>V1</w:t>
+      </w:r>
+    </w:p>
+    <w:p>
+      <w:pPr>
+        <w:rPr>
+          <w:sz w:val="28"/>
+          <w:szCs w:val="28"/>
+          <w:lang w:val="en-NZ" w:eastAsia="en-NZ"/>
+        </w:rPr>
+      </w:pPr>
+      <w:r>
+        <w:rPr>
           <w:noProof/>
-          <w:sz w:val="28"/>
-          <w:szCs w:val="28"/>
         </w:rPr>
         <w:drawing>
-          <wp:inline distT="0" distB="0" distL="0" distR="0" wp14:anchorId="6AEC79CC" wp14:editId="4F45FF55">
-            <wp:extent cx="3708400" cy="3595824"/>
-            <wp:effectExtent l="0" t="0" r="6350" b="5080"/>
-            <wp:docPr id="1260699537" name="Picture 3"/>
+          <wp:inline distT="0" distB="0" distL="0" distR="0" wp14:anchorId="42E356BA" wp14:editId="19056BA6">
+            <wp:extent cx="4540250" cy="2317750"/>
+            <wp:effectExtent l="0" t="0" r="0" b="6350"/>
+            <wp:docPr id="458393017" name="Picture 1"/>
             <wp:cNvGraphicFramePr>
               <a:graphicFrameLocks xmlns:a="http://schemas.openxmlformats.org/drawingml/2006/main" noChangeAspect="1"/>
             </wp:cNvGraphicFramePr>
@@ -4113,8 +4149,10 @@
               <a:graphicData uri="http://schemas.openxmlformats.org/drawingml/2006/picture">
                 <pic:pic xmlns:pic="http://schemas.openxmlformats.org/drawingml/2006/picture">
                   <pic:nvPicPr>
-                    <pic:cNvPr id="1260699537" name="Picture 1260699537"/>
-                    <pic:cNvPicPr/>
+                    <pic:cNvPr id="0" name="Picture 1"/>
+                    <pic:cNvPicPr>
+                      <a:picLocks noChangeAspect="1" noChangeArrowheads="1"/>
+                    </pic:cNvPicPr>
                   </pic:nvPicPr>
                   <pic:blipFill>
                     <a:blip r:embed="rId19">
@@ -4124,6 +4162,493 @@
                         </a:ext>
                       </a:extLst>
                     </a:blip>
+                    <a:srcRect/>
+                    <a:stretch>
+                      <a:fillRect/>
+                    </a:stretch>
+                  </pic:blipFill>
+                  <pic:spPr bwMode="auto">
+                    <a:xfrm>
+                      <a:off x="0" y="0"/>
+                      <a:ext cx="4540250" cy="2317750"/>
+                    </a:xfrm>
+                    <a:prstGeom prst="rect">
+                      <a:avLst/>
+                    </a:prstGeom>
+                    <a:noFill/>
+                    <a:ln>
+                      <a:noFill/>
+                    </a:ln>
+                  </pic:spPr>
+                </pic:pic>
+              </a:graphicData>
+            </a:graphic>
+          </wp:inline>
+        </w:drawing>
+      </w:r>
+    </w:p>
+    <w:p>
+      <w:pPr>
+        <w:rPr>
+          <w:sz w:val="28"/>
+          <w:szCs w:val="28"/>
+          <w:lang w:val="en-NZ" w:eastAsia="en-NZ"/>
+        </w:rPr>
+      </w:pPr>
+      <w:r>
+        <w:rPr>
+          <w:sz w:val="28"/>
+          <w:szCs w:val="28"/>
+          <w:lang w:val="en-NZ" w:eastAsia="en-NZ"/>
+        </w:rPr>
+        <w:t>V2</w:t>
+      </w:r>
+    </w:p>
+    <w:p>
+      <w:pPr>
+        <w:rPr>
+          <w:sz w:val="28"/>
+          <w:szCs w:val="28"/>
+          <w:lang w:val="en-NZ" w:eastAsia="en-NZ"/>
+        </w:rPr>
+      </w:pPr>
+      <w:r>
+        <w:rPr>
+          <w:noProof/>
+        </w:rPr>
+        <w:drawing>
+          <wp:inline distT="0" distB="0" distL="0" distR="0" wp14:anchorId="6CC81278" wp14:editId="0E74A3DE">
+            <wp:extent cx="5048250" cy="3086100"/>
+            <wp:effectExtent l="0" t="0" r="0" b="0"/>
+            <wp:docPr id="739803948" name="Picture 2"/>
+            <wp:cNvGraphicFramePr>
+              <a:graphicFrameLocks xmlns:a="http://schemas.openxmlformats.org/drawingml/2006/main" noChangeAspect="1"/>
+            </wp:cNvGraphicFramePr>
+            <a:graphic xmlns:a="http://schemas.openxmlformats.org/drawingml/2006/main">
+              <a:graphicData uri="http://schemas.openxmlformats.org/drawingml/2006/picture">
+                <pic:pic xmlns:pic="http://schemas.openxmlformats.org/drawingml/2006/picture">
+                  <pic:nvPicPr>
+                    <pic:cNvPr id="0" name="Picture 3"/>
+                    <pic:cNvPicPr>
+                      <a:picLocks noChangeAspect="1" noChangeArrowheads="1"/>
+                    </pic:cNvPicPr>
+                  </pic:nvPicPr>
+                  <pic:blipFill>
+                    <a:blip r:embed="rId20">
+                      <a:extLst>
+                        <a:ext uri="{28A0092B-C50C-407E-A947-70E740481C1C}">
+                          <a14:useLocalDpi xmlns:a14="http://schemas.microsoft.com/office/drawing/2010/main" val="0"/>
+                        </a:ext>
+                      </a:extLst>
+                    </a:blip>
+                    <a:srcRect/>
+                    <a:stretch>
+                      <a:fillRect/>
+                    </a:stretch>
+                  </pic:blipFill>
+                  <pic:spPr bwMode="auto">
+                    <a:xfrm>
+                      <a:off x="0" y="0"/>
+                      <a:ext cx="5048250" cy="3086100"/>
+                    </a:xfrm>
+                    <a:prstGeom prst="rect">
+                      <a:avLst/>
+                    </a:prstGeom>
+                    <a:noFill/>
+                    <a:ln>
+                      <a:noFill/>
+                    </a:ln>
+                  </pic:spPr>
+                </pic:pic>
+              </a:graphicData>
+            </a:graphic>
+          </wp:inline>
+        </w:drawing>
+      </w:r>
+    </w:p>
+    <w:p>
+      <w:pPr>
+        <w:rPr>
+          <w:sz w:val="28"/>
+          <w:szCs w:val="28"/>
+          <w:lang w:val="en-NZ" w:eastAsia="en-NZ"/>
+        </w:rPr>
+      </w:pPr>
+    </w:p>
+    <w:p>
+      <w:pPr>
+        <w:rPr>
+          <w:sz w:val="28"/>
+          <w:szCs w:val="28"/>
+          <w:lang w:val="en-NZ" w:eastAsia="en-NZ"/>
+        </w:rPr>
+      </w:pPr>
+    </w:p>
+    <w:p>
+      <w:pPr>
+        <w:rPr>
+          <w:sz w:val="28"/>
+          <w:szCs w:val="28"/>
+          <w:lang w:val="en-NZ" w:eastAsia="en-NZ"/>
+        </w:rPr>
+      </w:pPr>
+    </w:p>
+    <w:p>
+      <w:pPr>
+        <w:rPr>
+          <w:sz w:val="28"/>
+          <w:szCs w:val="28"/>
+          <w:lang w:val="en-NZ" w:eastAsia="en-NZ"/>
+        </w:rPr>
+      </w:pPr>
+    </w:p>
+    <w:p>
+      <w:pPr>
+        <w:rPr>
+          <w:sz w:val="28"/>
+          <w:szCs w:val="28"/>
+          <w:lang w:val="en-NZ" w:eastAsia="en-NZ"/>
+        </w:rPr>
+      </w:pPr>
+    </w:p>
+    <w:p>
+      <w:pPr>
+        <w:rPr>
+          <w:sz w:val="28"/>
+          <w:szCs w:val="28"/>
+          <w:lang w:val="en-NZ" w:eastAsia="en-NZ"/>
+        </w:rPr>
+      </w:pPr>
+    </w:p>
+    <w:p>
+      <w:pPr>
+        <w:rPr>
+          <w:sz w:val="28"/>
+          <w:szCs w:val="28"/>
+          <w:lang w:val="en-NZ" w:eastAsia="en-NZ"/>
+        </w:rPr>
+      </w:pPr>
+      <w:r>
+        <w:rPr>
+          <w:sz w:val="28"/>
+          <w:szCs w:val="28"/>
+          <w:lang w:val="en-NZ" w:eastAsia="en-NZ"/>
+        </w:rPr>
+        <w:lastRenderedPageBreak/>
+        <w:t>V3</w:t>
+      </w:r>
+    </w:p>
+    <w:p>
+      <w:pPr>
+        <w:rPr>
+          <w:sz w:val="28"/>
+          <w:szCs w:val="28"/>
+          <w:lang w:val="en-NZ" w:eastAsia="en-NZ"/>
+        </w:rPr>
+      </w:pPr>
+      <w:r>
+        <w:rPr>
+          <w:noProof/>
+        </w:rPr>
+        <w:drawing>
+          <wp:inline distT="0" distB="0" distL="0" distR="0" wp14:anchorId="0B0C6522" wp14:editId="093AE53F">
+            <wp:extent cx="5130800" cy="3206750"/>
+            <wp:effectExtent l="0" t="0" r="0" b="0"/>
+            <wp:docPr id="956832700" name="Picture 3"/>
+            <wp:cNvGraphicFramePr>
+              <a:graphicFrameLocks xmlns:a="http://schemas.openxmlformats.org/drawingml/2006/main" noChangeAspect="1"/>
+            </wp:cNvGraphicFramePr>
+            <a:graphic xmlns:a="http://schemas.openxmlformats.org/drawingml/2006/main">
+              <a:graphicData uri="http://schemas.openxmlformats.org/drawingml/2006/picture">
+                <pic:pic xmlns:pic="http://schemas.openxmlformats.org/drawingml/2006/picture">
+                  <pic:nvPicPr>
+                    <pic:cNvPr id="0" name="Picture 5"/>
+                    <pic:cNvPicPr>
+                      <a:picLocks noChangeAspect="1" noChangeArrowheads="1"/>
+                    </pic:cNvPicPr>
+                  </pic:nvPicPr>
+                  <pic:blipFill>
+                    <a:blip r:embed="rId21">
+                      <a:extLst>
+                        <a:ext uri="{28A0092B-C50C-407E-A947-70E740481C1C}">
+                          <a14:useLocalDpi xmlns:a14="http://schemas.microsoft.com/office/drawing/2010/main" val="0"/>
+                        </a:ext>
+                      </a:extLst>
+                    </a:blip>
+                    <a:srcRect/>
+                    <a:stretch>
+                      <a:fillRect/>
+                    </a:stretch>
+                  </pic:blipFill>
+                  <pic:spPr bwMode="auto">
+                    <a:xfrm>
+                      <a:off x="0" y="0"/>
+                      <a:ext cx="5130800" cy="3206750"/>
+                    </a:xfrm>
+                    <a:prstGeom prst="rect">
+                      <a:avLst/>
+                    </a:prstGeom>
+                    <a:noFill/>
+                    <a:ln>
+                      <a:noFill/>
+                    </a:ln>
+                  </pic:spPr>
+                </pic:pic>
+              </a:graphicData>
+            </a:graphic>
+          </wp:inline>
+        </w:drawing>
+      </w:r>
+    </w:p>
+    <w:p>
+      <w:pPr>
+        <w:rPr>
+          <w:sz w:val="28"/>
+          <w:szCs w:val="28"/>
+          <w:lang w:val="en-NZ" w:eastAsia="en-NZ"/>
+        </w:rPr>
+      </w:pPr>
+      <w:r>
+        <w:rPr>
+          <w:sz w:val="28"/>
+          <w:szCs w:val="28"/>
+          <w:lang w:val="en-NZ" w:eastAsia="en-NZ"/>
+        </w:rPr>
+        <w:t>V4</w:t>
+      </w:r>
+    </w:p>
+    <w:p>
+      <w:pPr>
+        <w:rPr>
+          <w:sz w:val="28"/>
+          <w:szCs w:val="28"/>
+          <w:lang w:val="en-NZ" w:eastAsia="en-NZ"/>
+        </w:rPr>
+      </w:pPr>
+      <w:r>
+        <w:rPr>
+          <w:noProof/>
+        </w:rPr>
+        <w:drawing>
+          <wp:inline distT="0" distB="0" distL="0" distR="0" wp14:anchorId="4B67E5C2" wp14:editId="719825EB">
+            <wp:extent cx="5092700" cy="3035300"/>
+            <wp:effectExtent l="0" t="0" r="0" b="0"/>
+            <wp:docPr id="1237149716" name="Picture 4"/>
+            <wp:cNvGraphicFramePr>
+              <a:graphicFrameLocks xmlns:a="http://schemas.openxmlformats.org/drawingml/2006/main" noChangeAspect="1"/>
+            </wp:cNvGraphicFramePr>
+            <a:graphic xmlns:a="http://schemas.openxmlformats.org/drawingml/2006/main">
+              <a:graphicData uri="http://schemas.openxmlformats.org/drawingml/2006/picture">
+                <pic:pic xmlns:pic="http://schemas.openxmlformats.org/drawingml/2006/picture">
+                  <pic:nvPicPr>
+                    <pic:cNvPr id="0" name="Picture 7"/>
+                    <pic:cNvPicPr>
+                      <a:picLocks noChangeAspect="1" noChangeArrowheads="1"/>
+                    </pic:cNvPicPr>
+                  </pic:nvPicPr>
+                  <pic:blipFill>
+                    <a:blip r:embed="rId22">
+                      <a:extLst>
+                        <a:ext uri="{28A0092B-C50C-407E-A947-70E740481C1C}">
+                          <a14:useLocalDpi xmlns:a14="http://schemas.microsoft.com/office/drawing/2010/main" val="0"/>
+                        </a:ext>
+                      </a:extLst>
+                    </a:blip>
+                    <a:srcRect/>
+                    <a:stretch>
+                      <a:fillRect/>
+                    </a:stretch>
+                  </pic:blipFill>
+                  <pic:spPr bwMode="auto">
+                    <a:xfrm>
+                      <a:off x="0" y="0"/>
+                      <a:ext cx="5092700" cy="3035300"/>
+                    </a:xfrm>
+                    <a:prstGeom prst="rect">
+                      <a:avLst/>
+                    </a:prstGeom>
+                    <a:noFill/>
+                    <a:ln>
+                      <a:noFill/>
+                    </a:ln>
+                  </pic:spPr>
+                </pic:pic>
+              </a:graphicData>
+            </a:graphic>
+          </wp:inline>
+        </w:drawing>
+      </w:r>
+    </w:p>
+    <w:p>
+      <w:pPr>
+        <w:rPr>
+          <w:sz w:val="28"/>
+          <w:szCs w:val="28"/>
+          <w:lang w:val="en-NZ" w:eastAsia="en-NZ"/>
+        </w:rPr>
+      </w:pPr>
+    </w:p>
+    <w:p>
+      <w:pPr>
+        <w:rPr>
+          <w:sz w:val="28"/>
+          <w:szCs w:val="28"/>
+          <w:lang w:val="en-NZ" w:eastAsia="en-NZ"/>
+        </w:rPr>
+      </w:pPr>
+    </w:p>
+    <w:p>
+      <w:pPr>
+        <w:rPr>
+          <w:sz w:val="28"/>
+          <w:szCs w:val="28"/>
+          <w:lang w:val="en-NZ" w:eastAsia="en-NZ"/>
+        </w:rPr>
+      </w:pPr>
+    </w:p>
+    <w:p>
+      <w:pPr>
+        <w:rPr>
+          <w:sz w:val="28"/>
+          <w:szCs w:val="28"/>
+          <w:lang w:val="en-NZ" w:eastAsia="en-NZ"/>
+        </w:rPr>
+      </w:pPr>
+    </w:p>
+    <w:p>
+      <w:pPr>
+        <w:rPr>
+          <w:sz w:val="28"/>
+          <w:szCs w:val="28"/>
+          <w:lang w:val="en-NZ" w:eastAsia="en-NZ"/>
+        </w:rPr>
+      </w:pPr>
+    </w:p>
+    <w:p>
+      <w:pPr>
+        <w:rPr>
+          <w:sz w:val="28"/>
+          <w:szCs w:val="28"/>
+          <w:lang w:val="en-NZ" w:eastAsia="en-NZ"/>
+        </w:rPr>
+      </w:pPr>
+      <w:r>
+        <w:rPr>
+          <w:sz w:val="28"/>
+          <w:szCs w:val="28"/>
+          <w:lang w:val="en-NZ" w:eastAsia="en-NZ"/>
+        </w:rPr>
+        <w:lastRenderedPageBreak/>
+        <w:t>V5</w:t>
+      </w:r>
+    </w:p>
+    <w:p>
+      <w:pPr>
+        <w:rPr>
+          <w:sz w:val="28"/>
+          <w:szCs w:val="28"/>
+          <w:lang w:val="en-NZ" w:eastAsia="en-NZ"/>
+        </w:rPr>
+      </w:pPr>
+      <w:r>
+        <w:rPr>
+          <w:noProof/>
+        </w:rPr>
+        <w:drawing>
+          <wp:inline distT="0" distB="0" distL="0" distR="0" wp14:anchorId="7EE06EC7" wp14:editId="0730C896">
+            <wp:extent cx="4629150" cy="3867150"/>
+            <wp:effectExtent l="0" t="0" r="0" b="0"/>
+            <wp:docPr id="36073832" name="Picture 5"/>
+            <wp:cNvGraphicFramePr>
+              <a:graphicFrameLocks xmlns:a="http://schemas.openxmlformats.org/drawingml/2006/main" noChangeAspect="1"/>
+            </wp:cNvGraphicFramePr>
+            <a:graphic xmlns:a="http://schemas.openxmlformats.org/drawingml/2006/main">
+              <a:graphicData uri="http://schemas.openxmlformats.org/drawingml/2006/picture">
+                <pic:pic xmlns:pic="http://schemas.openxmlformats.org/drawingml/2006/picture">
+                  <pic:nvPicPr>
+                    <pic:cNvPr id="0" name="Picture 9"/>
+                    <pic:cNvPicPr>
+                      <a:picLocks noChangeAspect="1" noChangeArrowheads="1"/>
+                    </pic:cNvPicPr>
+                  </pic:nvPicPr>
+                  <pic:blipFill>
+                    <a:blip r:embed="rId23">
+                      <a:extLst>
+                        <a:ext uri="{28A0092B-C50C-407E-A947-70E740481C1C}">
+                          <a14:useLocalDpi xmlns:a14="http://schemas.microsoft.com/office/drawing/2010/main" val="0"/>
+                        </a:ext>
+                      </a:extLst>
+                    </a:blip>
+                    <a:srcRect/>
+                    <a:stretch>
+                      <a:fillRect/>
+                    </a:stretch>
+                  </pic:blipFill>
+                  <pic:spPr bwMode="auto">
+                    <a:xfrm>
+                      <a:off x="0" y="0"/>
+                      <a:ext cx="4629150" cy="3867150"/>
+                    </a:xfrm>
+                    <a:prstGeom prst="rect">
+                      <a:avLst/>
+                    </a:prstGeom>
+                    <a:noFill/>
+                    <a:ln>
+                      <a:noFill/>
+                    </a:ln>
+                  </pic:spPr>
+                </pic:pic>
+              </a:graphicData>
+            </a:graphic>
+          </wp:inline>
+        </w:drawing>
+      </w:r>
+    </w:p>
+    <w:p>
+      <w:pPr>
+        <w:rPr>
+          <w:sz w:val="28"/>
+          <w:szCs w:val="28"/>
+          <w:lang w:val="en-NZ" w:eastAsia="en-NZ"/>
+        </w:rPr>
+      </w:pPr>
+      <w:r>
+        <w:rPr>
+          <w:sz w:val="28"/>
+          <w:szCs w:val="28"/>
+          <w:lang w:val="en-NZ" w:eastAsia="en-NZ"/>
+        </w:rPr>
+        <w:t>Post-Coding</w:t>
+      </w:r>
+    </w:p>
+    <w:p>
+      <w:pPr>
+        <w:rPr>
+          <w:lang w:val="en-NZ" w:eastAsia="en-NZ"/>
+        </w:rPr>
+      </w:pPr>
+      <w:bookmarkStart w:id="15" w:name="_Toc141881222"/>
+      <w:r>
+        <w:rPr>
+          <w:lang w:val="en-NZ" w:eastAsia="en-NZ"/>
+        </w:rPr>
+        <w:drawing>
+          <wp:inline distT="0" distB="0" distL="0" distR="0" wp14:anchorId="74D6FF34" wp14:editId="77095E94">
+            <wp:extent cx="4540483" cy="3130711"/>
+            <wp:effectExtent l="0" t="0" r="0" b="0"/>
+            <wp:docPr id="180985599" name="Picture 1"/>
+            <wp:cNvGraphicFramePr>
+              <a:graphicFrameLocks xmlns:a="http://schemas.openxmlformats.org/drawingml/2006/main" noChangeAspect="1"/>
+            </wp:cNvGraphicFramePr>
+            <a:graphic xmlns:a="http://schemas.openxmlformats.org/drawingml/2006/main">
+              <a:graphicData uri="http://schemas.openxmlformats.org/drawingml/2006/picture">
+                <pic:pic xmlns:pic="http://schemas.openxmlformats.org/drawingml/2006/picture">
+                  <pic:nvPicPr>
+                    <pic:cNvPr id="180985599" name=""/>
+                    <pic:cNvPicPr/>
+                  </pic:nvPicPr>
+                  <pic:blipFill>
+                    <a:blip r:embed="rId24"/>
                     <a:stretch>
                       <a:fillRect/>
                     </a:stretch>
@@ -4131,7 +4656,7 @@
                   <pic:spPr>
                     <a:xfrm>
                       <a:off x="0" y="0"/>
-                      <a:ext cx="3720004" cy="3607075"/>
+                      <a:ext cx="4540483" cy="3130711"/>
                     </a:xfrm>
                     <a:prstGeom prst="rect">
                       <a:avLst/>
@@ -4145,184 +4670,6 @@
       </w:r>
     </w:p>
     <w:p>
-      <w:r>
-        <w:t>Manager Login</w:t>
-      </w:r>
-    </w:p>
-    <w:p>
-      <w:r>
-        <w:rPr>
-          <w:noProof/>
-        </w:rPr>
-        <w:drawing>
-          <wp:inline distT="0" distB="0" distL="0" distR="0" wp14:anchorId="01AE1D20" wp14:editId="35BF784D">
-            <wp:extent cx="3744928" cy="3625850"/>
-            <wp:effectExtent l="0" t="0" r="8255" b="0"/>
-            <wp:docPr id="1703992689" name="Picture 4"/>
-            <wp:cNvGraphicFramePr>
-              <a:graphicFrameLocks xmlns:a="http://schemas.openxmlformats.org/drawingml/2006/main" noChangeAspect="1"/>
-            </wp:cNvGraphicFramePr>
-            <a:graphic xmlns:a="http://schemas.openxmlformats.org/drawingml/2006/main">
-              <a:graphicData uri="http://schemas.openxmlformats.org/drawingml/2006/picture">
-                <pic:pic xmlns:pic="http://schemas.openxmlformats.org/drawingml/2006/picture">
-                  <pic:nvPicPr>
-                    <pic:cNvPr id="1703992689" name="Picture 1703992689"/>
-                    <pic:cNvPicPr/>
-                  </pic:nvPicPr>
-                  <pic:blipFill>
-                    <a:blip r:embed="rId20">
-                      <a:extLst>
-                        <a:ext uri="{28A0092B-C50C-407E-A947-70E740481C1C}">
-                          <a14:useLocalDpi xmlns:a14="http://schemas.microsoft.com/office/drawing/2010/main" val="0"/>
-                        </a:ext>
-                      </a:extLst>
-                    </a:blip>
-                    <a:stretch>
-                      <a:fillRect/>
-                    </a:stretch>
-                  </pic:blipFill>
-                  <pic:spPr>
-                    <a:xfrm>
-                      <a:off x="0" y="0"/>
-                      <a:ext cx="3759207" cy="3639675"/>
-                    </a:xfrm>
-                    <a:prstGeom prst="rect">
-                      <a:avLst/>
-                    </a:prstGeom>
-                  </pic:spPr>
-                </pic:pic>
-              </a:graphicData>
-            </a:graphic>
-          </wp:inline>
-        </w:drawing>
-      </w:r>
-    </w:p>
-    <w:p/>
-    <w:p/>
-    <w:p/>
-    <w:p>
-      <w:r>
-        <w:t>Customer Login</w:t>
-      </w:r>
-    </w:p>
-    <w:p>
-      <w:r>
-        <w:rPr>
-          <w:noProof/>
-        </w:rPr>
-        <w:drawing>
-          <wp:inline distT="0" distB="0" distL="0" distR="0" wp14:anchorId="474778CC" wp14:editId="4874E6D7">
-            <wp:extent cx="3536950" cy="4554346"/>
-            <wp:effectExtent l="0" t="0" r="6350" b="0"/>
-            <wp:docPr id="627920586" name="Picture 6"/>
-            <wp:cNvGraphicFramePr>
-              <a:graphicFrameLocks xmlns:a="http://schemas.openxmlformats.org/drawingml/2006/main" noChangeAspect="1"/>
-            </wp:cNvGraphicFramePr>
-            <a:graphic xmlns:a="http://schemas.openxmlformats.org/drawingml/2006/main">
-              <a:graphicData uri="http://schemas.openxmlformats.org/drawingml/2006/picture">
-                <pic:pic xmlns:pic="http://schemas.openxmlformats.org/drawingml/2006/picture">
-                  <pic:nvPicPr>
-                    <pic:cNvPr id="627920586" name="Picture 627920586"/>
-                    <pic:cNvPicPr/>
-                  </pic:nvPicPr>
-                  <pic:blipFill>
-                    <a:blip r:embed="rId21">
-                      <a:extLst>
-                        <a:ext uri="{28A0092B-C50C-407E-A947-70E740481C1C}">
-                          <a14:useLocalDpi xmlns:a14="http://schemas.microsoft.com/office/drawing/2010/main" val="0"/>
-                        </a:ext>
-                      </a:extLst>
-                    </a:blip>
-                    <a:stretch>
-                      <a:fillRect/>
-                    </a:stretch>
-                  </pic:blipFill>
-                  <pic:spPr>
-                    <a:xfrm>
-                      <a:off x="0" y="0"/>
-                      <a:ext cx="3546230" cy="4566295"/>
-                    </a:xfrm>
-                    <a:prstGeom prst="rect">
-                      <a:avLst/>
-                    </a:prstGeom>
-                  </pic:spPr>
-                </pic:pic>
-              </a:graphicData>
-            </a:graphic>
-          </wp:inline>
-        </w:drawing>
-      </w:r>
-      <w:r>
-        <w:t xml:space="preserve"> </w:t>
-      </w:r>
-    </w:p>
-    <w:p/>
-    <w:p/>
-    <w:p/>
-    <w:p/>
-    <w:p/>
-    <w:p/>
-    <w:p/>
-    <w:p/>
-    <w:p/>
-    <w:p/>
-    <w:p/>
-    <w:p/>
-    <w:p>
-      <w:r>
-        <w:lastRenderedPageBreak/>
-        <w:t>General View</w:t>
-      </w:r>
-    </w:p>
-    <w:p>
-      <w:r>
-        <w:rPr>
-          <w:noProof/>
-        </w:rPr>
-        <w:drawing>
-          <wp:inline distT="0" distB="0" distL="0" distR="0" wp14:anchorId="51AB5C8A" wp14:editId="17BAF878">
-            <wp:extent cx="2724150" cy="8105775"/>
-            <wp:effectExtent l="0" t="0" r="0" b="9525"/>
-            <wp:docPr id="786629761" name="Picture 2"/>
-            <wp:cNvGraphicFramePr>
-              <a:graphicFrameLocks xmlns:a="http://schemas.openxmlformats.org/drawingml/2006/main" noChangeAspect="1"/>
-            </wp:cNvGraphicFramePr>
-            <a:graphic xmlns:a="http://schemas.openxmlformats.org/drawingml/2006/main">
-              <a:graphicData uri="http://schemas.openxmlformats.org/drawingml/2006/picture">
-                <pic:pic xmlns:pic="http://schemas.openxmlformats.org/drawingml/2006/picture">
-                  <pic:nvPicPr>
-                    <pic:cNvPr id="786629761" name="Picture 786629761"/>
-                    <pic:cNvPicPr/>
-                  </pic:nvPicPr>
-                  <pic:blipFill>
-                    <a:blip r:embed="rId22">
-                      <a:extLst>
-                        <a:ext uri="{28A0092B-C50C-407E-A947-70E740481C1C}">
-                          <a14:useLocalDpi xmlns:a14="http://schemas.microsoft.com/office/drawing/2010/main" val="0"/>
-                        </a:ext>
-                      </a:extLst>
-                    </a:blip>
-                    <a:stretch>
-                      <a:fillRect/>
-                    </a:stretch>
-                  </pic:blipFill>
-                  <pic:spPr>
-                    <a:xfrm>
-                      <a:off x="0" y="0"/>
-                      <a:ext cx="2724150" cy="8105775"/>
-                    </a:xfrm>
-                    <a:prstGeom prst="rect">
-                      <a:avLst/>
-                    </a:prstGeom>
-                  </pic:spPr>
-                </pic:pic>
-              </a:graphicData>
-            </a:graphic>
-          </wp:inline>
-        </w:drawing>
-      </w:r>
-    </w:p>
-    <w:p>
       <w:pPr>
         <w:pStyle w:val="Heading2"/>
         <w:rPr>
@@ -4333,7 +4680,12 @@
           <w:szCs w:val="28"/>
         </w:rPr>
       </w:pPr>
-      <w:r>
+    </w:p>
+    <w:p/>
+    <w:p/>
+    <w:p>
+      <w:pPr>
+        <w:pStyle w:val="Heading2"/>
         <w:rPr>
           <w:rFonts w:asciiTheme="minorHAnsi" w:hAnsiTheme="minorHAnsi" w:cstheme="minorHAnsi"/>
           <w:b/>
@@ -4341,28 +4693,8 @@
           <w:sz w:val="28"/>
           <w:szCs w:val="28"/>
         </w:rPr>
-        <w:lastRenderedPageBreak/>
-        <w:t>Use case diagram</w:t>
-      </w:r>
-      <w:bookmarkEnd w:id="13"/>
-    </w:p>
-    <w:p>
-      <w:pPr>
-        <w:rPr>
-          <w:lang w:val="en-NZ" w:eastAsia="en-NZ"/>
-        </w:rPr>
-      </w:pPr>
-    </w:p>
-    <w:p>
-      <w:pPr>
-        <w:rPr>
-          <w:lang w:val="en-NZ" w:eastAsia="en-NZ"/>
-        </w:rPr>
-      </w:pPr>
-    </w:p>
-    <w:p>
-      <w:pPr>
-        <w:pStyle w:val="Heading2"/>
+      </w:pPr>
+      <w:r>
         <w:rPr>
           <w:rFonts w:asciiTheme="minorHAnsi" w:hAnsiTheme="minorHAnsi" w:cstheme="minorHAnsi"/>
           <w:b/>
@@ -4370,8 +4702,10 @@
           <w:sz w:val="28"/>
           <w:szCs w:val="28"/>
         </w:rPr>
-      </w:pPr>
-      <w:bookmarkStart w:id="14" w:name="_Toc141881221"/>
+        <w:lastRenderedPageBreak/>
+        <w:t>Class diagra</w:t>
+      </w:r>
+      <w:bookmarkEnd w:id="15"/>
       <w:r>
         <w:rPr>
           <w:rFonts w:asciiTheme="minorHAnsi" w:hAnsiTheme="minorHAnsi" w:cstheme="minorHAnsi"/>
@@ -4380,97 +4714,8 @@
           <w:sz w:val="28"/>
           <w:szCs w:val="28"/>
         </w:rPr>
-        <w:t>Entity relationship diagram</w:t>
-      </w:r>
-      <w:bookmarkEnd w:id="14"/>
-    </w:p>
-    <w:p>
-      <w:pPr>
-        <w:rPr>
-          <w:lang w:val="en-NZ" w:eastAsia="en-NZ"/>
-        </w:rPr>
-      </w:pPr>
-    </w:p>
-    <w:p>
-      <w:pPr>
-        <w:rPr>
-          <w:lang w:val="en-NZ" w:eastAsia="en-NZ"/>
-        </w:rPr>
-      </w:pPr>
-    </w:p>
-    <w:p>
-      <w:pPr>
-        <w:pStyle w:val="Heading2"/>
-        <w:rPr>
-          <w:rFonts w:eastAsia="Times New Roman"/>
-          <w:lang w:val="en-NZ" w:eastAsia="en-NZ"/>
-        </w:rPr>
-      </w:pPr>
-      <w:bookmarkStart w:id="15" w:name="_Toc141881222"/>
-    </w:p>
-    <w:p>
-      <w:pPr>
-        <w:pStyle w:val="Heading2"/>
-        <w:rPr>
-          <w:rFonts w:eastAsia="Times New Roman"/>
-          <w:lang w:val="en-NZ" w:eastAsia="en-NZ"/>
-        </w:rPr>
-      </w:pPr>
-    </w:p>
-    <w:p>
-      <w:pPr>
-        <w:pStyle w:val="Heading2"/>
-        <w:rPr>
-          <w:rFonts w:eastAsia="Times New Roman"/>
-          <w:lang w:val="en-NZ" w:eastAsia="en-NZ"/>
-        </w:rPr>
-      </w:pPr>
-    </w:p>
-    <w:p>
-      <w:pPr>
-        <w:pStyle w:val="Heading2"/>
-        <w:rPr>
-          <w:rFonts w:eastAsia="Times New Roman"/>
-          <w:lang w:val="en-NZ" w:eastAsia="en-NZ"/>
-        </w:rPr>
-      </w:pPr>
-    </w:p>
-    <w:p>
-      <w:pPr>
-        <w:rPr>
-          <w:lang w:val="en-NZ" w:eastAsia="en-NZ"/>
-        </w:rPr>
-      </w:pPr>
-    </w:p>
-    <w:p>
-      <w:pPr>
-        <w:rPr>
-          <w:lang w:val="en-NZ" w:eastAsia="en-NZ"/>
-        </w:rPr>
-      </w:pPr>
-    </w:p>
-    <w:p>
-      <w:pPr>
-        <w:pStyle w:val="Heading2"/>
-        <w:rPr>
-          <w:rFonts w:asciiTheme="minorHAnsi" w:hAnsiTheme="minorHAnsi" w:cstheme="minorHAnsi"/>
-          <w:b/>
-          <w:bCs/>
-          <w:sz w:val="28"/>
-          <w:szCs w:val="28"/>
-        </w:rPr>
-      </w:pPr>
-      <w:r>
-        <w:rPr>
-          <w:rFonts w:asciiTheme="minorHAnsi" w:hAnsiTheme="minorHAnsi" w:cstheme="minorHAnsi"/>
-          <w:b/>
-          <w:bCs/>
-          <w:sz w:val="28"/>
-          <w:szCs w:val="28"/>
-        </w:rPr>
-        <w:t>Class diagram</w:t>
-      </w:r>
-      <w:bookmarkEnd w:id="15"/>
+        <w:t>m</w:t>
+      </w:r>
     </w:p>
     <w:p>
       <w:pPr>
@@ -4505,7 +4750,6 @@
           <w:sz w:val="44"/>
           <w:lang w:val="en-NZ" w:eastAsia="en-NZ"/>
         </w:rPr>
-        <w:lastRenderedPageBreak/>
         <w:drawing>
           <wp:inline distT="0" distB="0" distL="0" distR="0" wp14:anchorId="61EFD73B" wp14:editId="6A8B5222">
             <wp:extent cx="4740348" cy="8045450"/>
@@ -4522,7 +4766,7 @@
                     <pic:cNvPicPr/>
                   </pic:nvPicPr>
                   <pic:blipFill>
-                    <a:blip r:embed="rId23">
+                    <a:blip r:embed="rId25">
                       <a:extLst>
                         <a:ext uri="{28A0092B-C50C-407E-A947-70E740481C1C}">
                           <a14:useLocalDpi xmlns:a14="http://schemas.microsoft.com/office/drawing/2010/main" val="0"/>
@@ -4586,6 +4830,57 @@
           <w:lang w:val="en-NZ" w:eastAsia="en-NZ"/>
         </w:rPr>
       </w:pPr>
+      <w:r>
+        <w:rPr>
+          <w:rFonts w:asciiTheme="majorHAnsi" w:eastAsia="Times New Roman" w:hAnsiTheme="majorHAnsi" w:cstheme="majorBidi"/>
+          <w:noProof/>
+          <w:color w:val="2F5496" w:themeColor="accent1" w:themeShade="BF"/>
+          <w:sz w:val="44"/>
+          <w:szCs w:val="32"/>
+          <w:lang w:val="en-NZ" w:eastAsia="en-NZ"/>
+        </w:rPr>
+        <w:drawing>
+          <wp:inline distT="0" distB="0" distL="0" distR="0" wp14:anchorId="03A89362" wp14:editId="0C66B07B">
+            <wp:extent cx="3130062" cy="8473510"/>
+            <wp:effectExtent l="0" t="0" r="0" b="3810"/>
+            <wp:docPr id="1421502229" name="Picture 7"/>
+            <wp:cNvGraphicFramePr>
+              <a:graphicFrameLocks xmlns:a="http://schemas.openxmlformats.org/drawingml/2006/main" noChangeAspect="1"/>
+            </wp:cNvGraphicFramePr>
+            <a:graphic xmlns:a="http://schemas.openxmlformats.org/drawingml/2006/main">
+              <a:graphicData uri="http://schemas.openxmlformats.org/drawingml/2006/picture">
+                <pic:pic xmlns:pic="http://schemas.openxmlformats.org/drawingml/2006/picture">
+                  <pic:nvPicPr>
+                    <pic:cNvPr id="1421502229" name="Picture 1421502229"/>
+                    <pic:cNvPicPr/>
+                  </pic:nvPicPr>
+                  <pic:blipFill>
+                    <a:blip r:embed="rId26">
+                      <a:extLst>
+                        <a:ext uri="{28A0092B-C50C-407E-A947-70E740481C1C}">
+                          <a14:useLocalDpi xmlns:a14="http://schemas.microsoft.com/office/drawing/2010/main" val="0"/>
+                        </a:ext>
+                      </a:extLst>
+                    </a:blip>
+                    <a:stretch>
+                      <a:fillRect/>
+                    </a:stretch>
+                  </pic:blipFill>
+                  <pic:spPr>
+                    <a:xfrm>
+                      <a:off x="0" y="0"/>
+                      <a:ext cx="3149913" cy="8527249"/>
+                    </a:xfrm>
+                    <a:prstGeom prst="rect">
+                      <a:avLst/>
+                    </a:prstGeom>
+                  </pic:spPr>
+                </pic:pic>
+              </a:graphicData>
+            </a:graphic>
+          </wp:inline>
+        </w:drawing>
+      </w:r>
     </w:p>
     <w:p>
       <w:pPr>
@@ -4604,6 +4899,7 @@
           <w:sz w:val="44"/>
           <w:lang w:val="en-NZ" w:eastAsia="en-NZ"/>
         </w:rPr>
+        <w:lastRenderedPageBreak/>
         <w:t>Development</w:t>
       </w:r>
       <w:bookmarkEnd w:id="16"/>
@@ -5435,7 +5731,7 @@
 </file>
 
 <file path=word/endnotes.xml><?xml version="1.0" encoding="utf-8"?>
-<w:endnotes xmlns:wpc="http://schemas.microsoft.com/office/word/2010/wordprocessingCanvas" xmlns:cx="http://schemas.microsoft.com/office/drawing/2014/chartex" xmlns:cx1="http://schemas.microsoft.com/office/drawing/2015/9/8/chartex" xmlns:cx2="http://schemas.microsoft.com/office/drawing/2015/10/21/chartex" xmlns:cx3="http://schemas.microsoft.com/office/drawing/2016/5/9/chartex" xmlns:cx4="http://schemas.microsoft.com/office/drawing/2016/5/10/chartex" xmlns:cx5="http://schemas.microsoft.com/office/drawing/2016/5/11/chartex" xmlns:cx6="http://schemas.microsoft.com/office/drawing/2016/5/12/chartex" xmlns:cx7="http://schemas.microsoft.com/office/drawing/2016/5/13/chartex" xmlns:cx8="http://schemas.microsoft.com/office/drawing/2016/5/14/chartex" xmlns:mc="http://schemas.openxmlformats.org/markup-compatibility/2006" xmlns:aink="http://schemas.microsoft.com/office/drawing/2016/ink" xmlns:am3d="http://schemas.microsoft.com/office/drawing/2017/model3d" xmlns:o="urn:schemas-microsoft-com:office:office" xmlns:oel="http://schemas.microsoft.com/office/2019/extlst" xmlns:r="http://schemas.openxmlformats.org/officeDocument/2006/relationships" xmlns:m="http://schemas.openxmlformats.org/officeDocument/2006/math" xmlns:v="urn:schemas-microsoft-com:vml" xmlns:wp14="http://schemas.microsoft.com/office/word/2010/wordprocessingDrawing" xmlns:wp="http://schemas.openxmlformats.org/drawingml/2006/wordprocessingDrawing" xmlns:w10="urn:schemas-microsoft-com:office:word" xmlns:w="http://schemas.openxmlformats.org/wordprocessingml/2006/main" xmlns:w14="http://schemas.microsoft.com/office/word/2010/wordml" xmlns:w15="http://schemas.microsoft.com/office/word/2012/wordml" xmlns:w16cex="http://schemas.microsoft.com/office/word/2018/wordml/cex" xmlns:w16cid="http://schemas.microsoft.com/office/word/2016/wordml/cid" xmlns:w16="http://schemas.microsoft.com/office/word/2018/wordml" xmlns:w16du="http://schemas.microsoft.com/office/word/2023/wordml/word16du" xmlns:w16sdtdh="http://schemas.microsoft.com/office/word/2020/wordml/sdtdatahash" xmlns:w16sdtfl="http://schemas.microsoft.com/office/word/2024/wordml/sdtformatlock" xmlns:w16se="http://schemas.microsoft.com/office/word/2015/wordml/symex" xmlns:wpg="http://schemas.microsoft.com/office/word/2010/wordprocessingGroup" xmlns:wpi="http://schemas.microsoft.com/office/word/2010/wordprocessingInk" xmlns:wne="http://schemas.microsoft.com/office/word/2006/wordml" xmlns:wps="http://schemas.microsoft.com/office/word/2010/wordprocessingShape" mc:Ignorable="w14 w15 w16se w16cid w16 w16cex w16sdtdh w16sdtfl w16du wp14">
+<w:endnotes xmlns:wpc="http://schemas.microsoft.com/office/word/2010/wordprocessingCanvas" xmlns:cx="http://schemas.microsoft.com/office/drawing/2014/chartex" xmlns:cx1="http://schemas.microsoft.com/office/drawing/2015/9/8/chartex" xmlns:cx2="http://schemas.microsoft.com/office/drawing/2015/10/21/chartex" xmlns:cx3="http://schemas.microsoft.com/office/drawing/2016/5/9/chartex" xmlns:cx4="http://schemas.microsoft.com/office/drawing/2016/5/10/chartex" xmlns:cx5="http://schemas.microsoft.com/office/drawing/2016/5/11/chartex" xmlns:cx6="http://schemas.microsoft.com/office/drawing/2016/5/12/chartex" xmlns:cx7="http://schemas.microsoft.com/office/drawing/2016/5/13/chartex" xmlns:cx8="http://schemas.microsoft.com/office/drawing/2016/5/14/chartex" xmlns:mc="http://schemas.openxmlformats.org/markup-compatibility/2006" xmlns:aink="http://schemas.microsoft.com/office/drawing/2016/ink" xmlns:am3d="http://schemas.microsoft.com/office/drawing/2017/model3d" xmlns:o="urn:schemas-microsoft-com:office:office" xmlns:oel="http://schemas.microsoft.com/office/2019/extlst" xmlns:r="http://schemas.openxmlformats.org/officeDocument/2006/relationships" xmlns:m="http://schemas.openxmlformats.org/officeDocument/2006/math" xmlns:v="urn:schemas-microsoft-com:vml" xmlns:wp14="http://schemas.microsoft.com/office/word/2010/wordprocessingDrawing" xmlns:wp="http://schemas.openxmlformats.org/drawingml/2006/wordprocessingDrawing" xmlns:w10="urn:schemas-microsoft-com:office:word" xmlns:w="http://schemas.openxmlformats.org/wordprocessingml/2006/main" xmlns:w14="http://schemas.microsoft.com/office/word/2010/wordml" xmlns:w15="http://schemas.microsoft.com/office/word/2012/wordml" xmlns:w16cei="http://schemas.microsoft.com/office/word/2026/wordml/cei" xmlns:w16cex="http://schemas.microsoft.com/office/word/2018/wordml/cex" xmlns:w16cid="http://schemas.microsoft.com/office/word/2016/wordml/cid" xmlns:w16="http://schemas.microsoft.com/office/word/2018/wordml" xmlns:w16du="http://schemas.microsoft.com/office/word/2023/wordml/word16du" xmlns:w16sdtdh="http://schemas.microsoft.com/office/word/2020/wordml/sdtdatahash" xmlns:w16sdtfl="http://schemas.microsoft.com/office/word/2024/wordml/sdtformatlock" xmlns:w16se="http://schemas.microsoft.com/office/word/2015/wordml/symex" xmlns:wpg="http://schemas.microsoft.com/office/word/2010/wordprocessingGroup" xmlns:wpi="http://schemas.microsoft.com/office/word/2010/wordprocessingInk" xmlns:wne="http://schemas.microsoft.com/office/word/2006/wordml" xmlns:wps="http://schemas.microsoft.com/office/word/2010/wordprocessingShape" mc:Ignorable="w14 w15 w16se w16cid w16 w16cex w16sdtdh w16sdtfl w16du wp14">
   <w:endnote w:type="separator" w:id="-1">
     <w:p>
       <w:pPr>
@@ -5460,7 +5756,7 @@
 </file>
 
 <file path=word/footer1.xml><?xml version="1.0" encoding="utf-8"?>
-<w:ftr xmlns:wpc="http://schemas.microsoft.com/office/word/2010/wordprocessingCanvas" xmlns:cx="http://schemas.microsoft.com/office/drawing/2014/chartex" xmlns:cx1="http://schemas.microsoft.com/office/drawing/2015/9/8/chartex" xmlns:cx2="http://schemas.microsoft.com/office/drawing/2015/10/21/chartex" xmlns:cx3="http://schemas.microsoft.com/office/drawing/2016/5/9/chartex" xmlns:cx4="http://schemas.microsoft.com/office/drawing/2016/5/10/chartex" xmlns:cx5="http://schemas.microsoft.com/office/drawing/2016/5/11/chartex" xmlns:cx6="http://schemas.microsoft.com/office/drawing/2016/5/12/chartex" xmlns:cx7="http://schemas.microsoft.com/office/drawing/2016/5/13/chartex" xmlns:cx8="http://schemas.microsoft.com/office/drawing/2016/5/14/chartex" xmlns:mc="http://schemas.openxmlformats.org/markup-compatibility/2006" xmlns:aink="http://schemas.microsoft.com/office/drawing/2016/ink" xmlns:am3d="http://schemas.microsoft.com/office/drawing/2017/model3d" xmlns:o="urn:schemas-microsoft-com:office:office" xmlns:oel="http://schemas.microsoft.com/office/2019/extlst" xmlns:r="http://schemas.openxmlformats.org/officeDocument/2006/relationships" xmlns:m="http://schemas.openxmlformats.org/officeDocument/2006/math" xmlns:v="urn:schemas-microsoft-com:vml" xmlns:wp14="http://schemas.microsoft.com/office/word/2010/wordprocessingDrawing" xmlns:wp="http://schemas.openxmlformats.org/drawingml/2006/wordprocessingDrawing" xmlns:w10="urn:schemas-microsoft-com:office:word" xmlns:w="http://schemas.openxmlformats.org/wordprocessingml/2006/main" xmlns:w14="http://schemas.microsoft.com/office/word/2010/wordml" xmlns:w15="http://schemas.microsoft.com/office/word/2012/wordml" xmlns:w16cex="http://schemas.microsoft.com/office/word/2018/wordml/cex" xmlns:w16cid="http://schemas.microsoft.com/office/word/2016/wordml/cid" xmlns:w16="http://schemas.microsoft.com/office/word/2018/wordml" xmlns:w16du="http://schemas.microsoft.com/office/word/2023/wordml/word16du" xmlns:w16sdtdh="http://schemas.microsoft.com/office/word/2020/wordml/sdtdatahash" xmlns:w16sdtfl="http://schemas.microsoft.com/office/word/2024/wordml/sdtformatlock" xmlns:w16se="http://schemas.microsoft.com/office/word/2015/wordml/symex" xmlns:wpg="http://schemas.microsoft.com/office/word/2010/wordprocessingGroup" xmlns:wpi="http://schemas.microsoft.com/office/word/2010/wordprocessingInk" xmlns:wne="http://schemas.microsoft.com/office/word/2006/wordml" xmlns:wps="http://schemas.microsoft.com/office/word/2010/wordprocessingShape" mc:Ignorable="w14 w15 w16se w16cid w16 w16cex w16sdtdh w16sdtfl w16du wp14">
+<w:ftr xmlns:wpc="http://schemas.microsoft.com/office/word/2010/wordprocessingCanvas" xmlns:cx="http://schemas.microsoft.com/office/drawing/2014/chartex" xmlns:cx1="http://schemas.microsoft.com/office/drawing/2015/9/8/chartex" xmlns:cx2="http://schemas.microsoft.com/office/drawing/2015/10/21/chartex" xmlns:cx3="http://schemas.microsoft.com/office/drawing/2016/5/9/chartex" xmlns:cx4="http://schemas.microsoft.com/office/drawing/2016/5/10/chartex" xmlns:cx5="http://schemas.microsoft.com/office/drawing/2016/5/11/chartex" xmlns:cx6="http://schemas.microsoft.com/office/drawing/2016/5/12/chartex" xmlns:cx7="http://schemas.microsoft.com/office/drawing/2016/5/13/chartex" xmlns:cx8="http://schemas.microsoft.com/office/drawing/2016/5/14/chartex" xmlns:mc="http://schemas.openxmlformats.org/markup-compatibility/2006" xmlns:aink="http://schemas.microsoft.com/office/drawing/2016/ink" xmlns:am3d="http://schemas.microsoft.com/office/drawing/2017/model3d" xmlns:o="urn:schemas-microsoft-com:office:office" xmlns:oel="http://schemas.microsoft.com/office/2019/extlst" xmlns:r="http://schemas.openxmlformats.org/officeDocument/2006/relationships" xmlns:m="http://schemas.openxmlformats.org/officeDocument/2006/math" xmlns:v="urn:schemas-microsoft-com:vml" xmlns:wp14="http://schemas.microsoft.com/office/word/2010/wordprocessingDrawing" xmlns:wp="http://schemas.openxmlformats.org/drawingml/2006/wordprocessingDrawing" xmlns:w10="urn:schemas-microsoft-com:office:word" xmlns:w="http://schemas.openxmlformats.org/wordprocessingml/2006/main" xmlns:w14="http://schemas.microsoft.com/office/word/2010/wordml" xmlns:w15="http://schemas.microsoft.com/office/word/2012/wordml" xmlns:w16cei="http://schemas.microsoft.com/office/word/2026/wordml/cei" xmlns:w16cex="http://schemas.microsoft.com/office/word/2018/wordml/cex" xmlns:w16cid="http://schemas.microsoft.com/office/word/2016/wordml/cid" xmlns:w16="http://schemas.microsoft.com/office/word/2018/wordml" xmlns:w16du="http://schemas.microsoft.com/office/word/2023/wordml/word16du" xmlns:w16sdtdh="http://schemas.microsoft.com/office/word/2020/wordml/sdtdatahash" xmlns:w16sdtfl="http://schemas.microsoft.com/office/word/2024/wordml/sdtformatlock" xmlns:w16se="http://schemas.microsoft.com/office/word/2015/wordml/symex" xmlns:wpg="http://schemas.microsoft.com/office/word/2010/wordprocessingGroup" xmlns:wpi="http://schemas.microsoft.com/office/word/2010/wordprocessingInk" xmlns:wne="http://schemas.microsoft.com/office/word/2006/wordml" xmlns:wps="http://schemas.microsoft.com/office/word/2010/wordprocessingShape" mc:Ignorable="w14 w15 w16se w16cid w16 w16cex w16sdtdh w16sdtfl w16du wp14">
   <w:sdt>
     <w:sdtPr>
       <w:id w:val="1722559848"/>
@@ -5514,7 +5810,7 @@
 </file>
 
 <file path=word/footer2.xml><?xml version="1.0" encoding="utf-8"?>
-<w:ftr xmlns:wpc="http://schemas.microsoft.com/office/word/2010/wordprocessingCanvas" xmlns:cx="http://schemas.microsoft.com/office/drawing/2014/chartex" xmlns:cx1="http://schemas.microsoft.com/office/drawing/2015/9/8/chartex" xmlns:cx2="http://schemas.microsoft.com/office/drawing/2015/10/21/chartex" xmlns:cx3="http://schemas.microsoft.com/office/drawing/2016/5/9/chartex" xmlns:cx4="http://schemas.microsoft.com/office/drawing/2016/5/10/chartex" xmlns:cx5="http://schemas.microsoft.com/office/drawing/2016/5/11/chartex" xmlns:cx6="http://schemas.microsoft.com/office/drawing/2016/5/12/chartex" xmlns:cx7="http://schemas.microsoft.com/office/drawing/2016/5/13/chartex" xmlns:cx8="http://schemas.microsoft.com/office/drawing/2016/5/14/chartex" xmlns:mc="http://schemas.openxmlformats.org/markup-compatibility/2006" xmlns:aink="http://schemas.microsoft.com/office/drawing/2016/ink" xmlns:am3d="http://schemas.microsoft.com/office/drawing/2017/model3d" xmlns:o="urn:schemas-microsoft-com:office:office" xmlns:oel="http://schemas.microsoft.com/office/2019/extlst" xmlns:r="http://schemas.openxmlformats.org/officeDocument/2006/relationships" xmlns:m="http://schemas.openxmlformats.org/officeDocument/2006/math" xmlns:v="urn:schemas-microsoft-com:vml" xmlns:wp14="http://schemas.microsoft.com/office/word/2010/wordprocessingDrawing" xmlns:wp="http://schemas.openxmlformats.org/drawingml/2006/wordprocessingDrawing" xmlns:w10="urn:schemas-microsoft-com:office:word" xmlns:w="http://schemas.openxmlformats.org/wordprocessingml/2006/main" xmlns:w14="http://schemas.microsoft.com/office/word/2010/wordml" xmlns:w15="http://schemas.microsoft.com/office/word/2012/wordml" xmlns:w16cex="http://schemas.microsoft.com/office/word/2018/wordml/cex" xmlns:w16cid="http://schemas.microsoft.com/office/word/2016/wordml/cid" xmlns:w16="http://schemas.microsoft.com/office/word/2018/wordml" xmlns:w16du="http://schemas.microsoft.com/office/word/2023/wordml/word16du" xmlns:w16sdtdh="http://schemas.microsoft.com/office/word/2020/wordml/sdtdatahash" xmlns:w16sdtfl="http://schemas.microsoft.com/office/word/2024/wordml/sdtformatlock" xmlns:w16se="http://schemas.microsoft.com/office/word/2015/wordml/symex" xmlns:wpg="http://schemas.microsoft.com/office/word/2010/wordprocessingGroup" xmlns:wpi="http://schemas.microsoft.com/office/word/2010/wordprocessingInk" xmlns:wne="http://schemas.microsoft.com/office/word/2006/wordml" xmlns:wps="http://schemas.microsoft.com/office/word/2010/wordprocessingShape" mc:Ignorable="w14 w15 w16se w16cid w16 w16cex w16sdtdh w16sdtfl w16du wp14">
+<w:ftr xmlns:wpc="http://schemas.microsoft.com/office/word/2010/wordprocessingCanvas" xmlns:cx="http://schemas.microsoft.com/office/drawing/2014/chartex" xmlns:cx1="http://schemas.microsoft.com/office/drawing/2015/9/8/chartex" xmlns:cx2="http://schemas.microsoft.com/office/drawing/2015/10/21/chartex" xmlns:cx3="http://schemas.microsoft.com/office/drawing/2016/5/9/chartex" xmlns:cx4="http://schemas.microsoft.com/office/drawing/2016/5/10/chartex" xmlns:cx5="http://schemas.microsoft.com/office/drawing/2016/5/11/chartex" xmlns:cx6="http://schemas.microsoft.com/office/drawing/2016/5/12/chartex" xmlns:cx7="http://schemas.microsoft.com/office/drawing/2016/5/13/chartex" xmlns:cx8="http://schemas.microsoft.com/office/drawing/2016/5/14/chartex" xmlns:mc="http://schemas.openxmlformats.org/markup-compatibility/2006" xmlns:aink="http://schemas.microsoft.com/office/drawing/2016/ink" xmlns:am3d="http://schemas.microsoft.com/office/drawing/2017/model3d" xmlns:o="urn:schemas-microsoft-com:office:office" xmlns:oel="http://schemas.microsoft.com/office/2019/extlst" xmlns:r="http://schemas.openxmlformats.org/officeDocument/2006/relationships" xmlns:m="http://schemas.openxmlformats.org/officeDocument/2006/math" xmlns:v="urn:schemas-microsoft-com:vml" xmlns:wp14="http://schemas.microsoft.com/office/word/2010/wordprocessingDrawing" xmlns:wp="http://schemas.openxmlformats.org/drawingml/2006/wordprocessingDrawing" xmlns:w10="urn:schemas-microsoft-com:office:word" xmlns:w="http://schemas.openxmlformats.org/wordprocessingml/2006/main" xmlns:w14="http://schemas.microsoft.com/office/word/2010/wordml" xmlns:w15="http://schemas.microsoft.com/office/word/2012/wordml" xmlns:w16cei="http://schemas.microsoft.com/office/word/2026/wordml/cei" xmlns:w16cex="http://schemas.microsoft.com/office/word/2018/wordml/cex" xmlns:w16cid="http://schemas.microsoft.com/office/word/2016/wordml/cid" xmlns:w16="http://schemas.microsoft.com/office/word/2018/wordml" xmlns:w16du="http://schemas.microsoft.com/office/word/2023/wordml/word16du" xmlns:w16sdtdh="http://schemas.microsoft.com/office/word/2020/wordml/sdtdatahash" xmlns:w16sdtfl="http://schemas.microsoft.com/office/word/2024/wordml/sdtformatlock" xmlns:w16se="http://schemas.microsoft.com/office/word/2015/wordml/symex" xmlns:wpg="http://schemas.microsoft.com/office/word/2010/wordprocessingGroup" xmlns:wpi="http://schemas.microsoft.com/office/word/2010/wordprocessingInk" xmlns:wne="http://schemas.microsoft.com/office/word/2006/wordml" xmlns:wps="http://schemas.microsoft.com/office/word/2010/wordprocessingShape" mc:Ignorable="w14 w15 w16se w16cid w16 w16cex w16sdtdh w16sdtfl w16du wp14">
   <w:p>
     <w:pPr>
       <w:pStyle w:val="Footer"/>
@@ -5530,7 +5826,7 @@
 </file>
 
 <file path=word/footnotes.xml><?xml version="1.0" encoding="utf-8"?>
-<w:footnotes xmlns:wpc="http://schemas.microsoft.com/office/word/2010/wordprocessingCanvas" xmlns:cx="http://schemas.microsoft.com/office/drawing/2014/chartex" xmlns:cx1="http://schemas.microsoft.com/office/drawing/2015/9/8/chartex" xmlns:cx2="http://schemas.microsoft.com/office/drawing/2015/10/21/chartex" xmlns:cx3="http://schemas.microsoft.com/office/drawing/2016/5/9/chartex" xmlns:cx4="http://schemas.microsoft.com/office/drawing/2016/5/10/chartex" xmlns:cx5="http://schemas.microsoft.com/office/drawing/2016/5/11/chartex" xmlns:cx6="http://schemas.microsoft.com/office/drawing/2016/5/12/chartex" xmlns:cx7="http://schemas.microsoft.com/office/drawing/2016/5/13/chartex" xmlns:cx8="http://schemas.microsoft.com/office/drawing/2016/5/14/chartex" xmlns:mc="http://schemas.openxmlformats.org/markup-compatibility/2006" xmlns:aink="http://schemas.microsoft.com/office/drawing/2016/ink" xmlns:am3d="http://schemas.microsoft.com/office/drawing/2017/model3d" xmlns:o="urn:schemas-microsoft-com:office:office" xmlns:oel="http://schemas.microsoft.com/office/2019/extlst" xmlns:r="http://schemas.openxmlformats.org/officeDocument/2006/relationships" xmlns:m="http://schemas.openxmlformats.org/officeDocument/2006/math" xmlns:v="urn:schemas-microsoft-com:vml" xmlns:wp14="http://schemas.microsoft.com/office/word/2010/wordprocessingDrawing" xmlns:wp="http://schemas.openxmlformats.org/drawingml/2006/wordprocessingDrawing" xmlns:w10="urn:schemas-microsoft-com:office:word" xmlns:w="http://schemas.openxmlformats.org/wordprocessingml/2006/main" xmlns:w14="http://schemas.microsoft.com/office/word/2010/wordml" xmlns:w15="http://schemas.microsoft.com/office/word/2012/wordml" xmlns:w16cex="http://schemas.microsoft.com/office/word/2018/wordml/cex" xmlns:w16cid="http://schemas.microsoft.com/office/word/2016/wordml/cid" xmlns:w16="http://schemas.microsoft.com/office/word/2018/wordml" xmlns:w16du="http://schemas.microsoft.com/office/word/2023/wordml/word16du" xmlns:w16sdtdh="http://schemas.microsoft.com/office/word/2020/wordml/sdtdatahash" xmlns:w16sdtfl="http://schemas.microsoft.com/office/word/2024/wordml/sdtformatlock" xmlns:w16se="http://schemas.microsoft.com/office/word/2015/wordml/symex" xmlns:wpg="http://schemas.microsoft.com/office/word/2010/wordprocessingGroup" xmlns:wpi="http://schemas.microsoft.com/office/word/2010/wordprocessingInk" xmlns:wne="http://schemas.microsoft.com/office/word/2006/wordml" xmlns:wps="http://schemas.microsoft.com/office/word/2010/wordprocessingShape" mc:Ignorable="w14 w15 w16se w16cid w16 w16cex w16sdtdh w16sdtfl w16du wp14">
+<w:footnotes xmlns:wpc="http://schemas.microsoft.com/office/word/2010/wordprocessingCanvas" xmlns:cx="http://schemas.microsoft.com/office/drawing/2014/chartex" xmlns:cx1="http://schemas.microsoft.com/office/drawing/2015/9/8/chartex" xmlns:cx2="http://schemas.microsoft.com/office/drawing/2015/10/21/chartex" xmlns:cx3="http://schemas.microsoft.com/office/drawing/2016/5/9/chartex" xmlns:cx4="http://schemas.microsoft.com/office/drawing/2016/5/10/chartex" xmlns:cx5="http://schemas.microsoft.com/office/drawing/2016/5/11/chartex" xmlns:cx6="http://schemas.microsoft.com/office/drawing/2016/5/12/chartex" xmlns:cx7="http://schemas.microsoft.com/office/drawing/2016/5/13/chartex" xmlns:cx8="http://schemas.microsoft.com/office/drawing/2016/5/14/chartex" xmlns:mc="http://schemas.openxmlformats.org/markup-compatibility/2006" xmlns:aink="http://schemas.microsoft.com/office/drawing/2016/ink" xmlns:am3d="http://schemas.microsoft.com/office/drawing/2017/model3d" xmlns:o="urn:schemas-microsoft-com:office:office" xmlns:oel="http://schemas.microsoft.com/office/2019/extlst" xmlns:r="http://schemas.openxmlformats.org/officeDocument/2006/relationships" xmlns:m="http://schemas.openxmlformats.org/officeDocument/2006/math" xmlns:v="urn:schemas-microsoft-com:vml" xmlns:wp14="http://schemas.microsoft.com/office/word/2010/wordprocessingDrawing" xmlns:wp="http://schemas.openxmlformats.org/drawingml/2006/wordprocessingDrawing" xmlns:w10="urn:schemas-microsoft-com:office:word" xmlns:w="http://schemas.openxmlformats.org/wordprocessingml/2006/main" xmlns:w14="http://schemas.microsoft.com/office/word/2010/wordml" xmlns:w15="http://schemas.microsoft.com/office/word/2012/wordml" xmlns:w16cei="http://schemas.microsoft.com/office/word/2026/wordml/cei" xmlns:w16cex="http://schemas.microsoft.com/office/word/2018/wordml/cex" xmlns:w16cid="http://schemas.microsoft.com/office/word/2016/wordml/cid" xmlns:w16="http://schemas.microsoft.com/office/word/2018/wordml" xmlns:w16du="http://schemas.microsoft.com/office/word/2023/wordml/word16du" xmlns:w16sdtdh="http://schemas.microsoft.com/office/word/2020/wordml/sdtdatahash" xmlns:w16sdtfl="http://schemas.microsoft.com/office/word/2024/wordml/sdtformatlock" xmlns:w16se="http://schemas.microsoft.com/office/word/2015/wordml/symex" xmlns:wpg="http://schemas.microsoft.com/office/word/2010/wordprocessingGroup" xmlns:wpi="http://schemas.microsoft.com/office/word/2010/wordprocessingInk" xmlns:wne="http://schemas.microsoft.com/office/word/2006/wordml" xmlns:wps="http://schemas.microsoft.com/office/word/2010/wordprocessingShape" mc:Ignorable="w14 w15 w16se w16cid w16 w16cex w16sdtdh w16sdtfl w16du wp14">
   <w:footnote w:type="separator" w:id="-1">
     <w:p>
       <w:pPr>
@@ -5555,7 +5851,7 @@
 </file>
 
 <file path=word/numbering.xml><?xml version="1.0" encoding="utf-8"?>
-<w:numbering xmlns:wpc="http://schemas.microsoft.com/office/word/2010/wordprocessingCanvas" xmlns:cx="http://schemas.microsoft.com/office/drawing/2014/chartex" xmlns:cx1="http://schemas.microsoft.com/office/drawing/2015/9/8/chartex" xmlns:cx2="http://schemas.microsoft.com/office/drawing/2015/10/21/chartex" xmlns:cx3="http://schemas.microsoft.com/office/drawing/2016/5/9/chartex" xmlns:cx4="http://schemas.microsoft.com/office/drawing/2016/5/10/chartex" xmlns:cx5="http://schemas.microsoft.com/office/drawing/2016/5/11/chartex" xmlns:cx6="http://schemas.microsoft.com/office/drawing/2016/5/12/chartex" xmlns:cx7="http://schemas.microsoft.com/office/drawing/2016/5/13/chartex" xmlns:cx8="http://schemas.microsoft.com/office/drawing/2016/5/14/chartex" xmlns:mc="http://schemas.openxmlformats.org/markup-compatibility/2006" xmlns:aink="http://schemas.microsoft.com/office/drawing/2016/ink" xmlns:am3d="http://schemas.microsoft.com/office/drawing/2017/model3d" xmlns:o="urn:schemas-microsoft-com:office:office" xmlns:oel="http://schemas.microsoft.com/office/2019/extlst" xmlns:r="http://schemas.openxmlformats.org/officeDocument/2006/relationships" xmlns:m="http://schemas.openxmlformats.org/officeDocument/2006/math" xmlns:v="urn:schemas-microsoft-com:vml" xmlns:wp14="http://schemas.microsoft.com/office/word/2010/wordprocessingDrawing" xmlns:wp="http://schemas.openxmlformats.org/drawingml/2006/wordprocessingDrawing" xmlns:w10="urn:schemas-microsoft-com:office:word" xmlns:w="http://schemas.openxmlformats.org/wordprocessingml/2006/main" xmlns:w14="http://schemas.microsoft.com/office/word/2010/wordml" xmlns:w15="http://schemas.microsoft.com/office/word/2012/wordml" xmlns:w16cex="http://schemas.microsoft.com/office/word/2018/wordml/cex" xmlns:w16cid="http://schemas.microsoft.com/office/word/2016/wordml/cid" xmlns:w16="http://schemas.microsoft.com/office/word/2018/wordml" xmlns:w16du="http://schemas.microsoft.com/office/word/2023/wordml/word16du" xmlns:w16sdtdh="http://schemas.microsoft.com/office/word/2020/wordml/sdtdatahash" xmlns:w16sdtfl="http://schemas.microsoft.com/office/word/2024/wordml/sdtformatlock" xmlns:w16se="http://schemas.microsoft.com/office/word/2015/wordml/symex" xmlns:wpg="http://schemas.microsoft.com/office/word/2010/wordprocessingGroup" xmlns:wpi="http://schemas.microsoft.com/office/word/2010/wordprocessingInk" xmlns:wne="http://schemas.microsoft.com/office/word/2006/wordml" xmlns:wps="http://schemas.microsoft.com/office/word/2010/wordprocessingShape" mc:Ignorable="w14 w15 w16se w16cid w16 w16cex w16sdtdh w16sdtfl w16du wp14">
+<w:numbering xmlns:wpc="http://schemas.microsoft.com/office/word/2010/wordprocessingCanvas" xmlns:cx="http://schemas.microsoft.com/office/drawing/2014/chartex" xmlns:cx1="http://schemas.microsoft.com/office/drawing/2015/9/8/chartex" xmlns:cx2="http://schemas.microsoft.com/office/drawing/2015/10/21/chartex" xmlns:cx3="http://schemas.microsoft.com/office/drawing/2016/5/9/chartex" xmlns:cx4="http://schemas.microsoft.com/office/drawing/2016/5/10/chartex" xmlns:cx5="http://schemas.microsoft.com/office/drawing/2016/5/11/chartex" xmlns:cx6="http://schemas.microsoft.com/office/drawing/2016/5/12/chartex" xmlns:cx7="http://schemas.microsoft.com/office/drawing/2016/5/13/chartex" xmlns:cx8="http://schemas.microsoft.com/office/drawing/2016/5/14/chartex" xmlns:mc="http://schemas.openxmlformats.org/markup-compatibility/2006" xmlns:aink="http://schemas.microsoft.com/office/drawing/2016/ink" xmlns:am3d="http://schemas.microsoft.com/office/drawing/2017/model3d" xmlns:o="urn:schemas-microsoft-com:office:office" xmlns:oel="http://schemas.microsoft.com/office/2019/extlst" xmlns:r="http://schemas.openxmlformats.org/officeDocument/2006/relationships" xmlns:m="http://schemas.openxmlformats.org/officeDocument/2006/math" xmlns:v="urn:schemas-microsoft-com:vml" xmlns:wp14="http://schemas.microsoft.com/office/word/2010/wordprocessingDrawing" xmlns:wp="http://schemas.openxmlformats.org/drawingml/2006/wordprocessingDrawing" xmlns:w10="urn:schemas-microsoft-com:office:word" xmlns:w="http://schemas.openxmlformats.org/wordprocessingml/2006/main" xmlns:w14="http://schemas.microsoft.com/office/word/2010/wordml" xmlns:w15="http://schemas.microsoft.com/office/word/2012/wordml" xmlns:w16cei="http://schemas.microsoft.com/office/word/2026/wordml/cei" xmlns:w16cex="http://schemas.microsoft.com/office/word/2018/wordml/cex" xmlns:w16cid="http://schemas.microsoft.com/office/word/2016/wordml/cid" xmlns:w16="http://schemas.microsoft.com/office/word/2018/wordml" xmlns:w16du="http://schemas.microsoft.com/office/word/2023/wordml/word16du" xmlns:w16sdtdh="http://schemas.microsoft.com/office/word/2020/wordml/sdtdatahash" xmlns:w16sdtfl="http://schemas.microsoft.com/office/word/2024/wordml/sdtformatlock" xmlns:w16se="http://schemas.microsoft.com/office/word/2015/wordml/symex" xmlns:wpg="http://schemas.microsoft.com/office/word/2010/wordprocessingGroup" xmlns:wpi="http://schemas.microsoft.com/office/word/2010/wordprocessingInk" xmlns:wne="http://schemas.microsoft.com/office/word/2006/wordml" xmlns:wps="http://schemas.microsoft.com/office/word/2010/wordprocessingShape" mc:Ignorable="w14 w15 w16se w16cid w16 w16cex w16sdtdh w16sdtfl w16du wp14">
   <w:abstractNum w:abstractNumId="0" w15:restartNumberingAfterBreak="0">
     <w:nsid w:val="113B3281"/>
     <w:multiLevelType w:val="hybridMultilevel"/>
@@ -6835,6 +7131,18 @@
       <w:contextualSpacing/>
     </w:pPr>
   </w:style>
+  <w:style w:type="character" w:styleId="FollowedHyperlink">
+    <w:name w:val="FollowedHyperlink"/>
+    <w:basedOn w:val="DefaultParagraphFont"/>
+    <w:uiPriority w:val="99"/>
+    <w:semiHidden/>
+    <w:unhideWhenUsed/>
+    <w:rsid w:val="00216503"/>
+    <w:rPr>
+      <w:color w:val="954F72" w:themeColor="followedHyperlink"/>
+      <w:u w:val="single"/>
+    </w:rPr>
+  </w:style>
 </w:styles>
 </file>
 

</xml_diff>

<commit_message>
Added formatting to the Planes table
</commit_message>
<xml_diff>
--- a/12TPI Project/12TPI Project Write-Up.docx
+++ b/12TPI Project/12TPI Project Write-Up.docx
@@ -48,7 +48,7 @@
           <w:sz w:val="72"/>
           <w:lang w:val="en-NZ" w:eastAsia="en-NZ"/>
         </w:rPr>
-        <w:t>Title of your Project</w:t>
+        <w:t>Airport Database</w:t>
       </w:r>
     </w:p>
     <w:p>
@@ -3748,6 +3748,111 @@
     </w:p>
     <w:p>
       <w:pPr>
+        <w:rPr>
+          <w:lang w:val="en-NZ" w:eastAsia="en-NZ"/>
+        </w:rPr>
+      </w:pPr>
+      <w:r>
+        <w:rPr>
+          <w:rFonts w:cstheme="minorHAnsi"/>
+          <w:b/>
+          <w:bCs/>
+          <w:noProof/>
+          <w:sz w:val="28"/>
+          <w:szCs w:val="28"/>
+        </w:rPr>
+        <w:drawing>
+          <wp:inline distT="0" distB="0" distL="0" distR="0" wp14:anchorId="61D73B5E" wp14:editId="01C3AFA3">
+            <wp:extent cx="2317134" cy="3277772"/>
+            <wp:effectExtent l="0" t="0" r="6985" b="0"/>
+            <wp:docPr id="847380937" name="Picture 1"/>
+            <wp:cNvGraphicFramePr>
+              <a:graphicFrameLocks xmlns:a="http://schemas.openxmlformats.org/drawingml/2006/main" noChangeAspect="1"/>
+            </wp:cNvGraphicFramePr>
+            <a:graphic xmlns:a="http://schemas.openxmlformats.org/drawingml/2006/main">
+              <a:graphicData uri="http://schemas.openxmlformats.org/drawingml/2006/picture">
+                <pic:pic xmlns:pic="http://schemas.openxmlformats.org/drawingml/2006/picture">
+                  <pic:nvPicPr>
+                    <pic:cNvPr id="847380937" name="Picture 847380937"/>
+                    <pic:cNvPicPr/>
+                  </pic:nvPicPr>
+                  <pic:blipFill>
+                    <a:blip r:embed="rId17" cstate="print">
+                      <a:extLst>
+                        <a:ext uri="{28A0092B-C50C-407E-A947-70E740481C1C}">
+                          <a14:useLocalDpi xmlns:a14="http://schemas.microsoft.com/office/drawing/2010/main" val="0"/>
+                        </a:ext>
+                      </a:extLst>
+                    </a:blip>
+                    <a:stretch>
+                      <a:fillRect/>
+                    </a:stretch>
+                  </pic:blipFill>
+                  <pic:spPr>
+                    <a:xfrm>
+                      <a:off x="0" y="0"/>
+                      <a:ext cx="2338765" cy="3308371"/>
+                    </a:xfrm>
+                    <a:prstGeom prst="rect">
+                      <a:avLst/>
+                    </a:prstGeom>
+                  </pic:spPr>
+                </pic:pic>
+              </a:graphicData>
+            </a:graphic>
+          </wp:inline>
+        </w:drawing>
+      </w:r>
+      <w:r>
+        <w:rPr>
+          <w:noProof/>
+          <w:lang w:val="en-NZ" w:eastAsia="en-NZ"/>
+        </w:rPr>
+        <w:drawing>
+          <wp:inline distT="0" distB="0" distL="0" distR="0" wp14:anchorId="3390F27B" wp14:editId="00A980ED">
+            <wp:extent cx="2314136" cy="3273532"/>
+            <wp:effectExtent l="0" t="0" r="0" b="3175"/>
+            <wp:docPr id="1293507461" name="Picture 2"/>
+            <wp:cNvGraphicFramePr>
+              <a:graphicFrameLocks xmlns:a="http://schemas.openxmlformats.org/drawingml/2006/main" noChangeAspect="1"/>
+            </wp:cNvGraphicFramePr>
+            <a:graphic xmlns:a="http://schemas.openxmlformats.org/drawingml/2006/main">
+              <a:graphicData uri="http://schemas.openxmlformats.org/drawingml/2006/picture">
+                <pic:pic xmlns:pic="http://schemas.openxmlformats.org/drawingml/2006/picture">
+                  <pic:nvPicPr>
+                    <pic:cNvPr id="1293507461" name="Picture 1293507461"/>
+                    <pic:cNvPicPr/>
+                  </pic:nvPicPr>
+                  <pic:blipFill>
+                    <a:blip r:embed="rId18" cstate="print">
+                      <a:extLst>
+                        <a:ext uri="{28A0092B-C50C-407E-A947-70E740481C1C}">
+                          <a14:useLocalDpi xmlns:a14="http://schemas.microsoft.com/office/drawing/2010/main" val="0"/>
+                        </a:ext>
+                      </a:extLst>
+                    </a:blip>
+                    <a:stretch>
+                      <a:fillRect/>
+                    </a:stretch>
+                  </pic:blipFill>
+                  <pic:spPr>
+                    <a:xfrm>
+                      <a:off x="0" y="0"/>
+                      <a:ext cx="2346839" cy="3319793"/>
+                    </a:xfrm>
+                    <a:prstGeom prst="rect">
+                      <a:avLst/>
+                    </a:prstGeom>
+                  </pic:spPr>
+                </pic:pic>
+              </a:graphicData>
+            </a:graphic>
+          </wp:inline>
+        </w:drawing>
+      </w:r>
+    </w:p>
+    <w:p>
+      <w:pPr>
         <w:pStyle w:val="Heading2"/>
         <w:rPr>
           <w:rFonts w:asciiTheme="minorHAnsi" w:hAnsiTheme="minorHAnsi" w:cstheme="minorHAnsi"/>
@@ -3757,18 +3862,463 @@
           <w:szCs w:val="28"/>
         </w:rPr>
       </w:pPr>
-    </w:p>
-    <w:p>
-      <w:pPr>
-        <w:pStyle w:val="Heading2"/>
+      <w:r>
         <w:rPr>
           <w:rFonts w:asciiTheme="minorHAnsi" w:hAnsiTheme="minorHAnsi" w:cstheme="minorHAnsi"/>
           <w:b/>
           <w:bCs/>
-          <w:sz w:val="28"/>
-          <w:szCs w:val="28"/>
-        </w:rPr>
-      </w:pPr>
+          <w:noProof/>
+          <w:sz w:val="28"/>
+          <w:szCs w:val="28"/>
+        </w:rPr>
+        <w:lastRenderedPageBreak/>
+        <w:drawing>
+          <wp:inline distT="0" distB="0" distL="0" distR="0" wp14:anchorId="2AFA450E" wp14:editId="0D1BDAE7">
+            <wp:extent cx="2437508" cy="3448050"/>
+            <wp:effectExtent l="0" t="0" r="1270" b="0"/>
+            <wp:docPr id="195035224" name="Picture 3"/>
+            <wp:cNvGraphicFramePr>
+              <a:graphicFrameLocks xmlns:a="http://schemas.openxmlformats.org/drawingml/2006/main" noChangeAspect="1"/>
+            </wp:cNvGraphicFramePr>
+            <a:graphic xmlns:a="http://schemas.openxmlformats.org/drawingml/2006/main">
+              <a:graphicData uri="http://schemas.openxmlformats.org/drawingml/2006/picture">
+                <pic:pic xmlns:pic="http://schemas.openxmlformats.org/drawingml/2006/picture">
+                  <pic:nvPicPr>
+                    <pic:cNvPr id="195035224" name="Picture 195035224"/>
+                    <pic:cNvPicPr/>
+                  </pic:nvPicPr>
+                  <pic:blipFill>
+                    <a:blip r:embed="rId19" cstate="print">
+                      <a:extLst>
+                        <a:ext uri="{28A0092B-C50C-407E-A947-70E740481C1C}">
+                          <a14:useLocalDpi xmlns:a14="http://schemas.microsoft.com/office/drawing/2010/main" val="0"/>
+                        </a:ext>
+                      </a:extLst>
+                    </a:blip>
+                    <a:stretch>
+                      <a:fillRect/>
+                    </a:stretch>
+                  </pic:blipFill>
+                  <pic:spPr>
+                    <a:xfrm>
+                      <a:off x="0" y="0"/>
+                      <a:ext cx="2448498" cy="3463596"/>
+                    </a:xfrm>
+                    <a:prstGeom prst="rect">
+                      <a:avLst/>
+                    </a:prstGeom>
+                  </pic:spPr>
+                </pic:pic>
+              </a:graphicData>
+            </a:graphic>
+          </wp:inline>
+        </w:drawing>
+      </w:r>
+      <w:r>
+        <w:rPr>
+          <w:rFonts w:asciiTheme="minorHAnsi" w:hAnsiTheme="minorHAnsi" w:cstheme="minorHAnsi"/>
+          <w:b/>
+          <w:bCs/>
+          <w:noProof/>
+          <w:sz w:val="28"/>
+          <w:szCs w:val="28"/>
+        </w:rPr>
+        <w:drawing>
+          <wp:inline distT="0" distB="0" distL="0" distR="0" wp14:anchorId="0B2FC060" wp14:editId="57E87D4D">
+            <wp:extent cx="2428529" cy="3435350"/>
+            <wp:effectExtent l="0" t="0" r="0" b="0"/>
+            <wp:docPr id="776643498" name="Picture 4"/>
+            <wp:cNvGraphicFramePr>
+              <a:graphicFrameLocks xmlns:a="http://schemas.openxmlformats.org/drawingml/2006/main" noChangeAspect="1"/>
+            </wp:cNvGraphicFramePr>
+            <a:graphic xmlns:a="http://schemas.openxmlformats.org/drawingml/2006/main">
+              <a:graphicData uri="http://schemas.openxmlformats.org/drawingml/2006/picture">
+                <pic:pic xmlns:pic="http://schemas.openxmlformats.org/drawingml/2006/picture">
+                  <pic:nvPicPr>
+                    <pic:cNvPr id="776643498" name="Picture 776643498"/>
+                    <pic:cNvPicPr/>
+                  </pic:nvPicPr>
+                  <pic:blipFill>
+                    <a:blip r:embed="rId20" cstate="print">
+                      <a:extLst>
+                        <a:ext uri="{28A0092B-C50C-407E-A947-70E740481C1C}">
+                          <a14:useLocalDpi xmlns:a14="http://schemas.microsoft.com/office/drawing/2010/main" val="0"/>
+                        </a:ext>
+                      </a:extLst>
+                    </a:blip>
+                    <a:stretch>
+                      <a:fillRect/>
+                    </a:stretch>
+                  </pic:blipFill>
+                  <pic:spPr>
+                    <a:xfrm>
+                      <a:off x="0" y="0"/>
+                      <a:ext cx="2444494" cy="3457934"/>
+                    </a:xfrm>
+                    <a:prstGeom prst="rect">
+                      <a:avLst/>
+                    </a:prstGeom>
+                  </pic:spPr>
+                </pic:pic>
+              </a:graphicData>
+            </a:graphic>
+          </wp:inline>
+        </w:drawing>
+      </w:r>
+    </w:p>
+    <w:p>
+      <w:r>
+        <w:rPr>
+          <w:noProof/>
+        </w:rPr>
+        <w:drawing>
+          <wp:inline distT="0" distB="0" distL="0" distR="0" wp14:anchorId="0A1AC43E" wp14:editId="12AED32F">
+            <wp:extent cx="2509332" cy="3549650"/>
+            <wp:effectExtent l="0" t="0" r="5715" b="0"/>
+            <wp:docPr id="1061047274" name="Picture 5"/>
+            <wp:cNvGraphicFramePr>
+              <a:graphicFrameLocks xmlns:a="http://schemas.openxmlformats.org/drawingml/2006/main" noChangeAspect="1"/>
+            </wp:cNvGraphicFramePr>
+            <a:graphic xmlns:a="http://schemas.openxmlformats.org/drawingml/2006/main">
+              <a:graphicData uri="http://schemas.openxmlformats.org/drawingml/2006/picture">
+                <pic:pic xmlns:pic="http://schemas.openxmlformats.org/drawingml/2006/picture">
+                  <pic:nvPicPr>
+                    <pic:cNvPr id="1061047274" name="Picture 1061047274"/>
+                    <pic:cNvPicPr/>
+                  </pic:nvPicPr>
+                  <pic:blipFill>
+                    <a:blip r:embed="rId21" cstate="print">
+                      <a:extLst>
+                        <a:ext uri="{28A0092B-C50C-407E-A947-70E740481C1C}">
+                          <a14:useLocalDpi xmlns:a14="http://schemas.microsoft.com/office/drawing/2010/main" val="0"/>
+                        </a:ext>
+                      </a:extLst>
+                    </a:blip>
+                    <a:stretch>
+                      <a:fillRect/>
+                    </a:stretch>
+                  </pic:blipFill>
+                  <pic:spPr>
+                    <a:xfrm>
+                      <a:off x="0" y="0"/>
+                      <a:ext cx="2522351" cy="3568067"/>
+                    </a:xfrm>
+                    <a:prstGeom prst="rect">
+                      <a:avLst/>
+                    </a:prstGeom>
+                  </pic:spPr>
+                </pic:pic>
+              </a:graphicData>
+            </a:graphic>
+          </wp:inline>
+        </w:drawing>
+      </w:r>
+      <w:r>
+        <w:rPr>
+          <w:noProof/>
+        </w:rPr>
+        <w:drawing>
+          <wp:inline distT="0" distB="0" distL="0" distR="0" wp14:anchorId="11FF6168" wp14:editId="3085A8F0">
+            <wp:extent cx="2509331" cy="3549650"/>
+            <wp:effectExtent l="0" t="0" r="5715" b="0"/>
+            <wp:docPr id="1848455549" name="Picture 6"/>
+            <wp:cNvGraphicFramePr>
+              <a:graphicFrameLocks xmlns:a="http://schemas.openxmlformats.org/drawingml/2006/main" noChangeAspect="1"/>
+            </wp:cNvGraphicFramePr>
+            <a:graphic xmlns:a="http://schemas.openxmlformats.org/drawingml/2006/main">
+              <a:graphicData uri="http://schemas.openxmlformats.org/drawingml/2006/picture">
+                <pic:pic xmlns:pic="http://schemas.openxmlformats.org/drawingml/2006/picture">
+                  <pic:nvPicPr>
+                    <pic:cNvPr id="1848455549" name="Picture 1848455549"/>
+                    <pic:cNvPicPr/>
+                  </pic:nvPicPr>
+                  <pic:blipFill>
+                    <a:blip r:embed="rId22" cstate="print">
+                      <a:extLst>
+                        <a:ext uri="{28A0092B-C50C-407E-A947-70E740481C1C}">
+                          <a14:useLocalDpi xmlns:a14="http://schemas.microsoft.com/office/drawing/2010/main" val="0"/>
+                        </a:ext>
+                      </a:extLst>
+                    </a:blip>
+                    <a:stretch>
+                      <a:fillRect/>
+                    </a:stretch>
+                  </pic:blipFill>
+                  <pic:spPr>
+                    <a:xfrm>
+                      <a:off x="0" y="0"/>
+                      <a:ext cx="2541017" cy="3594472"/>
+                    </a:xfrm>
+                    <a:prstGeom prst="rect">
+                      <a:avLst/>
+                    </a:prstGeom>
+                  </pic:spPr>
+                </pic:pic>
+              </a:graphicData>
+            </a:graphic>
+          </wp:inline>
+        </w:drawing>
+      </w:r>
+    </w:p>
+    <w:p/>
+    <w:p/>
+    <w:p/>
+    <w:p/>
+    <w:p/>
+    <w:p/>
+    <w:p>
+      <w:r>
+        <w:rPr>
+          <w:noProof/>
+        </w:rPr>
+        <w:lastRenderedPageBreak/>
+        <w:drawing>
+          <wp:inline distT="0" distB="0" distL="0" distR="0" wp14:anchorId="0F10C9D5" wp14:editId="3973F4DE">
+            <wp:extent cx="2540000" cy="3593032"/>
+            <wp:effectExtent l="0" t="0" r="0" b="7620"/>
+            <wp:docPr id="2009015070" name="Picture 7"/>
+            <wp:cNvGraphicFramePr>
+              <a:graphicFrameLocks xmlns:a="http://schemas.openxmlformats.org/drawingml/2006/main" noChangeAspect="1"/>
+            </wp:cNvGraphicFramePr>
+            <a:graphic xmlns:a="http://schemas.openxmlformats.org/drawingml/2006/main">
+              <a:graphicData uri="http://schemas.openxmlformats.org/drawingml/2006/picture">
+                <pic:pic xmlns:pic="http://schemas.openxmlformats.org/drawingml/2006/picture">
+                  <pic:nvPicPr>
+                    <pic:cNvPr id="2009015070" name="Picture 2009015070"/>
+                    <pic:cNvPicPr/>
+                  </pic:nvPicPr>
+                  <pic:blipFill>
+                    <a:blip r:embed="rId23" cstate="print">
+                      <a:extLst>
+                        <a:ext uri="{28A0092B-C50C-407E-A947-70E740481C1C}">
+                          <a14:useLocalDpi xmlns:a14="http://schemas.microsoft.com/office/drawing/2010/main" val="0"/>
+                        </a:ext>
+                      </a:extLst>
+                    </a:blip>
+                    <a:stretch>
+                      <a:fillRect/>
+                    </a:stretch>
+                  </pic:blipFill>
+                  <pic:spPr>
+                    <a:xfrm>
+                      <a:off x="0" y="0"/>
+                      <a:ext cx="2555312" cy="3614692"/>
+                    </a:xfrm>
+                    <a:prstGeom prst="rect">
+                      <a:avLst/>
+                    </a:prstGeom>
+                  </pic:spPr>
+                </pic:pic>
+              </a:graphicData>
+            </a:graphic>
+          </wp:inline>
+        </w:drawing>
+      </w:r>
+      <w:r>
+        <w:rPr>
+          <w:noProof/>
+        </w:rPr>
+        <w:drawing>
+          <wp:inline distT="0" distB="0" distL="0" distR="0" wp14:anchorId="50179C9E" wp14:editId="43269020">
+            <wp:extent cx="2540000" cy="3593033"/>
+            <wp:effectExtent l="0" t="0" r="0" b="7620"/>
+            <wp:docPr id="1552521755" name="Picture 8"/>
+            <wp:cNvGraphicFramePr>
+              <a:graphicFrameLocks xmlns:a="http://schemas.openxmlformats.org/drawingml/2006/main" noChangeAspect="1"/>
+            </wp:cNvGraphicFramePr>
+            <a:graphic xmlns:a="http://schemas.openxmlformats.org/drawingml/2006/main">
+              <a:graphicData uri="http://schemas.openxmlformats.org/drawingml/2006/picture">
+                <pic:pic xmlns:pic="http://schemas.openxmlformats.org/drawingml/2006/picture">
+                  <pic:nvPicPr>
+                    <pic:cNvPr id="1552521755" name="Picture 1552521755"/>
+                    <pic:cNvPicPr/>
+                  </pic:nvPicPr>
+                  <pic:blipFill>
+                    <a:blip r:embed="rId24" cstate="print">
+                      <a:extLst>
+                        <a:ext uri="{28A0092B-C50C-407E-A947-70E740481C1C}">
+                          <a14:useLocalDpi xmlns:a14="http://schemas.microsoft.com/office/drawing/2010/main" val="0"/>
+                        </a:ext>
+                      </a:extLst>
+                    </a:blip>
+                    <a:stretch>
+                      <a:fillRect/>
+                    </a:stretch>
+                  </pic:blipFill>
+                  <pic:spPr>
+                    <a:xfrm>
+                      <a:off x="0" y="0"/>
+                      <a:ext cx="2557183" cy="3617340"/>
+                    </a:xfrm>
+                    <a:prstGeom prst="rect">
+                      <a:avLst/>
+                    </a:prstGeom>
+                  </pic:spPr>
+                </pic:pic>
+              </a:graphicData>
+            </a:graphic>
+          </wp:inline>
+        </w:drawing>
+      </w:r>
+    </w:p>
+    <w:p>
+      <w:r>
+        <w:rPr>
+          <w:noProof/>
+        </w:rPr>
+        <w:drawing>
+          <wp:inline distT="0" distB="0" distL="0" distR="0" wp14:anchorId="7E984ADF" wp14:editId="53AD8726">
+            <wp:extent cx="2657467" cy="3759200"/>
+            <wp:effectExtent l="0" t="0" r="0" b="0"/>
+            <wp:docPr id="979531588" name="Picture 9"/>
+            <wp:cNvGraphicFramePr>
+              <a:graphicFrameLocks xmlns:a="http://schemas.openxmlformats.org/drawingml/2006/main" noChangeAspect="1"/>
+            </wp:cNvGraphicFramePr>
+            <a:graphic xmlns:a="http://schemas.openxmlformats.org/drawingml/2006/main">
+              <a:graphicData uri="http://schemas.openxmlformats.org/drawingml/2006/picture">
+                <pic:pic xmlns:pic="http://schemas.openxmlformats.org/drawingml/2006/picture">
+                  <pic:nvPicPr>
+                    <pic:cNvPr id="979531588" name="Picture 979531588"/>
+                    <pic:cNvPicPr/>
+                  </pic:nvPicPr>
+                  <pic:blipFill>
+                    <a:blip r:embed="rId25" cstate="print">
+                      <a:extLst>
+                        <a:ext uri="{28A0092B-C50C-407E-A947-70E740481C1C}">
+                          <a14:useLocalDpi xmlns:a14="http://schemas.microsoft.com/office/drawing/2010/main" val="0"/>
+                        </a:ext>
+                      </a:extLst>
+                    </a:blip>
+                    <a:stretch>
+                      <a:fillRect/>
+                    </a:stretch>
+                  </pic:blipFill>
+                  <pic:spPr>
+                    <a:xfrm>
+                      <a:off x="0" y="0"/>
+                      <a:ext cx="2676616" cy="3786287"/>
+                    </a:xfrm>
+                    <a:prstGeom prst="rect">
+                      <a:avLst/>
+                    </a:prstGeom>
+                  </pic:spPr>
+                </pic:pic>
+              </a:graphicData>
+            </a:graphic>
+          </wp:inline>
+        </w:drawing>
+      </w:r>
+      <w:r>
+        <w:rPr>
+          <w:noProof/>
+        </w:rPr>
+        <w:drawing>
+          <wp:inline distT="0" distB="0" distL="0" distR="0" wp14:anchorId="0A4AE441" wp14:editId="5C6CC424">
+            <wp:extent cx="2644002" cy="3740150"/>
+            <wp:effectExtent l="0" t="0" r="4445" b="0"/>
+            <wp:docPr id="1371782568" name="Picture 10"/>
+            <wp:cNvGraphicFramePr>
+              <a:graphicFrameLocks xmlns:a="http://schemas.openxmlformats.org/drawingml/2006/main" noChangeAspect="1"/>
+            </wp:cNvGraphicFramePr>
+            <a:graphic xmlns:a="http://schemas.openxmlformats.org/drawingml/2006/main">
+              <a:graphicData uri="http://schemas.openxmlformats.org/drawingml/2006/picture">
+                <pic:pic xmlns:pic="http://schemas.openxmlformats.org/drawingml/2006/picture">
+                  <pic:nvPicPr>
+                    <pic:cNvPr id="1371782568" name="Picture 1371782568"/>
+                    <pic:cNvPicPr/>
+                  </pic:nvPicPr>
+                  <pic:blipFill>
+                    <a:blip r:embed="rId26" cstate="print">
+                      <a:extLst>
+                        <a:ext uri="{28A0092B-C50C-407E-A947-70E740481C1C}">
+                          <a14:useLocalDpi xmlns:a14="http://schemas.microsoft.com/office/drawing/2010/main" val="0"/>
+                        </a:ext>
+                      </a:extLst>
+                    </a:blip>
+                    <a:stretch>
+                      <a:fillRect/>
+                    </a:stretch>
+                  </pic:blipFill>
+                  <pic:spPr>
+                    <a:xfrm>
+                      <a:off x="0" y="0"/>
+                      <a:ext cx="2658337" cy="3760428"/>
+                    </a:xfrm>
+                    <a:prstGeom prst="rect">
+                      <a:avLst/>
+                    </a:prstGeom>
+                  </pic:spPr>
+                </pic:pic>
+              </a:graphicData>
+            </a:graphic>
+          </wp:inline>
+        </w:drawing>
+      </w:r>
+    </w:p>
+    <w:p/>
+    <w:p>
+      <w:pPr>
+        <w:pStyle w:val="Heading2"/>
+        <w:rPr>
+          <w:rFonts w:asciiTheme="minorHAnsi" w:hAnsiTheme="minorHAnsi" w:cstheme="minorHAnsi"/>
+          <w:b/>
+          <w:bCs/>
+          <w:sz w:val="28"/>
+          <w:szCs w:val="28"/>
+        </w:rPr>
+      </w:pPr>
+      <w:r>
+        <w:rPr>
+          <w:rFonts w:asciiTheme="minorHAnsi" w:hAnsiTheme="minorHAnsi" w:cstheme="minorHAnsi"/>
+          <w:b/>
+          <w:bCs/>
+          <w:noProof/>
+          <w:sz w:val="28"/>
+          <w:szCs w:val="28"/>
+        </w:rPr>
+        <w:lastRenderedPageBreak/>
+        <w:drawing>
+          <wp:inline distT="0" distB="0" distL="0" distR="0" wp14:anchorId="1E8D99CA" wp14:editId="51D4667E">
+            <wp:extent cx="3073400" cy="4347570"/>
+            <wp:effectExtent l="0" t="0" r="0" b="0"/>
+            <wp:docPr id="1032648203" name="Picture 11"/>
+            <wp:cNvGraphicFramePr>
+              <a:graphicFrameLocks xmlns:a="http://schemas.openxmlformats.org/drawingml/2006/main" noChangeAspect="1"/>
+            </wp:cNvGraphicFramePr>
+            <a:graphic xmlns:a="http://schemas.openxmlformats.org/drawingml/2006/main">
+              <a:graphicData uri="http://schemas.openxmlformats.org/drawingml/2006/picture">
+                <pic:pic xmlns:pic="http://schemas.openxmlformats.org/drawingml/2006/picture">
+                  <pic:nvPicPr>
+                    <pic:cNvPr id="1032648203" name="Picture 1032648203"/>
+                    <pic:cNvPicPr/>
+                  </pic:nvPicPr>
+                  <pic:blipFill>
+                    <a:blip r:embed="rId27" cstate="print">
+                      <a:extLst>
+                        <a:ext uri="{28A0092B-C50C-407E-A947-70E740481C1C}">
+                          <a14:useLocalDpi xmlns:a14="http://schemas.microsoft.com/office/drawing/2010/main" val="0"/>
+                        </a:ext>
+                      </a:extLst>
+                    </a:blip>
+                    <a:stretch>
+                      <a:fillRect/>
+                    </a:stretch>
+                  </pic:blipFill>
+                  <pic:spPr>
+                    <a:xfrm>
+                      <a:off x="0" y="0"/>
+                      <a:ext cx="3078388" cy="4354627"/>
+                    </a:xfrm>
+                    <a:prstGeom prst="rect">
+                      <a:avLst/>
+                    </a:prstGeom>
+                  </pic:spPr>
+                </pic:pic>
+              </a:graphicData>
+            </a:graphic>
+          </wp:inline>
+        </w:drawing>
+      </w:r>
     </w:p>
     <w:p>
       <w:pPr>
@@ -3961,7 +4511,7 @@
                     <pic:cNvPicPr/>
                   </pic:nvPicPr>
                   <pic:blipFill>
-                    <a:blip r:embed="rId17" cstate="print">
+                    <a:blip r:embed="rId28" cstate="print">
                       <a:extLst>
                         <a:ext uri="{28A0092B-C50C-407E-A947-70E740481C1C}">
                           <a14:useLocalDpi xmlns:a14="http://schemas.microsoft.com/office/drawing/2010/main" val="0"/>
@@ -4039,7 +4589,7 @@
                     <pic:cNvPicPr/>
                   </pic:nvPicPr>
                   <pic:blipFill>
-                    <a:blip r:embed="rId18">
+                    <a:blip r:embed="rId29">
                       <a:extLst>
                         <a:ext uri="{28A0092B-C50C-407E-A947-70E740481C1C}">
                           <a14:useLocalDpi xmlns:a14="http://schemas.microsoft.com/office/drawing/2010/main" val="0"/>
@@ -4155,7 +4705,7 @@
                     </pic:cNvPicPr>
                   </pic:nvPicPr>
                   <pic:blipFill>
-                    <a:blip r:embed="rId19">
+                    <a:blip r:embed="rId30">
                       <a:extLst>
                         <a:ext uri="{28A0092B-C50C-407E-A947-70E740481C1C}">
                           <a14:useLocalDpi xmlns:a14="http://schemas.microsoft.com/office/drawing/2010/main" val="0"/>
@@ -4234,7 +4784,7 @@
                     </pic:cNvPicPr>
                   </pic:nvPicPr>
                   <pic:blipFill>
-                    <a:blip r:embed="rId20">
+                    <a:blip r:embed="rId31">
                       <a:extLst>
                         <a:ext uri="{28A0092B-C50C-407E-A947-70E740481C1C}">
                           <a14:useLocalDpi xmlns:a14="http://schemas.microsoft.com/office/drawing/2010/main" val="0"/>
@@ -4368,7 +4918,7 @@
                     </pic:cNvPicPr>
                   </pic:nvPicPr>
                   <pic:blipFill>
-                    <a:blip r:embed="rId21">
+                    <a:blip r:embed="rId32">
                       <a:extLst>
                         <a:ext uri="{28A0092B-C50C-407E-A947-70E740481C1C}">
                           <a14:useLocalDpi xmlns:a14="http://schemas.microsoft.com/office/drawing/2010/main" val="0"/>
@@ -4447,7 +4997,7 @@
                     </pic:cNvPicPr>
                   </pic:nvPicPr>
                   <pic:blipFill>
-                    <a:blip r:embed="rId22">
+                    <a:blip r:embed="rId33">
                       <a:extLst>
                         <a:ext uri="{28A0092B-C50C-407E-A947-70E740481C1C}">
                           <a14:useLocalDpi xmlns:a14="http://schemas.microsoft.com/office/drawing/2010/main" val="0"/>
@@ -4572,7 +5122,7 @@
                     </pic:cNvPicPr>
                   </pic:nvPicPr>
                   <pic:blipFill>
-                    <a:blip r:embed="rId23">
+                    <a:blip r:embed="rId34">
                       <a:extLst>
                         <a:ext uri="{28A0092B-C50C-407E-A947-70E740481C1C}">
                           <a14:useLocalDpi xmlns:a14="http://schemas.microsoft.com/office/drawing/2010/main" val="0"/>
@@ -4630,6 +5180,7 @@
       <w:bookmarkStart w:id="15" w:name="_Toc141881222"/>
       <w:r>
         <w:rPr>
+          <w:noProof/>
           <w:lang w:val="en-NZ" w:eastAsia="en-NZ"/>
         </w:rPr>
         <w:drawing>
@@ -4648,7 +5199,7 @@
                     <pic:cNvPicPr/>
                   </pic:nvPicPr>
                   <pic:blipFill>
-                    <a:blip r:embed="rId24"/>
+                    <a:blip r:embed="rId35"/>
                     <a:stretch>
                       <a:fillRect/>
                     </a:stretch>
@@ -4766,7 +5317,7 @@
                     <pic:cNvPicPr/>
                   </pic:nvPicPr>
                   <pic:blipFill>
-                    <a:blip r:embed="rId25">
+                    <a:blip r:embed="rId36">
                       <a:extLst>
                         <a:ext uri="{28A0092B-C50C-407E-A947-70E740481C1C}">
                           <a14:useLocalDpi xmlns:a14="http://schemas.microsoft.com/office/drawing/2010/main" val="0"/>
@@ -4855,7 +5406,7 @@
                     <pic:cNvPicPr/>
                   </pic:nvPicPr>
                   <pic:blipFill>
-                    <a:blip r:embed="rId26">
+                    <a:blip r:embed="rId37">
                       <a:extLst>
                         <a:ext uri="{28A0092B-C50C-407E-A947-70E740481C1C}">
                           <a14:useLocalDpi xmlns:a14="http://schemas.microsoft.com/office/drawing/2010/main" val="0"/>
@@ -4942,13 +5493,330 @@
           <w:lang w:val="en-NZ" w:eastAsia="en-NZ"/>
         </w:rPr>
       </w:pPr>
-    </w:p>
-    <w:p>
-      <w:pPr>
-        <w:rPr>
-          <w:lang w:val="en-NZ" w:eastAsia="en-NZ"/>
-        </w:rPr>
-      </w:pPr>
+      <w:r>
+        <w:rPr>
+          <w:lang w:val="en-NZ" w:eastAsia="en-NZ"/>
+        </w:rPr>
+        <w:drawing>
+          <wp:inline distT="0" distB="0" distL="0" distR="0" wp14:anchorId="021D90FE" wp14:editId="2C4DC253">
+            <wp:extent cx="5731510" cy="2909570"/>
+            <wp:effectExtent l="0" t="0" r="2540" b="5080"/>
+            <wp:docPr id="842868917" name="Picture 1"/>
+            <wp:cNvGraphicFramePr>
+              <a:graphicFrameLocks xmlns:a="http://schemas.openxmlformats.org/drawingml/2006/main" noChangeAspect="1"/>
+            </wp:cNvGraphicFramePr>
+            <a:graphic xmlns:a="http://schemas.openxmlformats.org/drawingml/2006/main">
+              <a:graphicData uri="http://schemas.openxmlformats.org/drawingml/2006/picture">
+                <pic:pic xmlns:pic="http://schemas.openxmlformats.org/drawingml/2006/picture">
+                  <pic:nvPicPr>
+                    <pic:cNvPr id="842868917" name=""/>
+                    <pic:cNvPicPr/>
+                  </pic:nvPicPr>
+                  <pic:blipFill>
+                    <a:blip r:embed="rId38"/>
+                    <a:stretch>
+                      <a:fillRect/>
+                    </a:stretch>
+                  </pic:blipFill>
+                  <pic:spPr>
+                    <a:xfrm>
+                      <a:off x="0" y="0"/>
+                      <a:ext cx="5731510" cy="2909570"/>
+                    </a:xfrm>
+                    <a:prstGeom prst="rect">
+                      <a:avLst/>
+                    </a:prstGeom>
+                  </pic:spPr>
+                </pic:pic>
+              </a:graphicData>
+            </a:graphic>
+          </wp:inline>
+        </w:drawing>
+      </w:r>
+    </w:p>
+    <w:p>
+      <w:pPr>
+        <w:rPr>
+          <w:lang w:val="en-NZ" w:eastAsia="en-NZ"/>
+        </w:rPr>
+      </w:pPr>
+      <w:r>
+        <w:rPr>
+          <w:lang w:val="en-NZ" w:eastAsia="en-NZ"/>
+        </w:rPr>
+        <w:drawing>
+          <wp:inline distT="0" distB="0" distL="0" distR="0" wp14:anchorId="7DBED628" wp14:editId="32B4486F">
+            <wp:extent cx="5731510" cy="2914650"/>
+            <wp:effectExtent l="0" t="0" r="2540" b="0"/>
+            <wp:docPr id="732467586" name="Picture 1"/>
+            <wp:cNvGraphicFramePr>
+              <a:graphicFrameLocks xmlns:a="http://schemas.openxmlformats.org/drawingml/2006/main" noChangeAspect="1"/>
+            </wp:cNvGraphicFramePr>
+            <a:graphic xmlns:a="http://schemas.openxmlformats.org/drawingml/2006/main">
+              <a:graphicData uri="http://schemas.openxmlformats.org/drawingml/2006/picture">
+                <pic:pic xmlns:pic="http://schemas.openxmlformats.org/drawingml/2006/picture">
+                  <pic:nvPicPr>
+                    <pic:cNvPr id="732467586" name=""/>
+                    <pic:cNvPicPr/>
+                  </pic:nvPicPr>
+                  <pic:blipFill>
+                    <a:blip r:embed="rId39"/>
+                    <a:stretch>
+                      <a:fillRect/>
+                    </a:stretch>
+                  </pic:blipFill>
+                  <pic:spPr>
+                    <a:xfrm>
+                      <a:off x="0" y="0"/>
+                      <a:ext cx="5731510" cy="2914650"/>
+                    </a:xfrm>
+                    <a:prstGeom prst="rect">
+                      <a:avLst/>
+                    </a:prstGeom>
+                  </pic:spPr>
+                </pic:pic>
+              </a:graphicData>
+            </a:graphic>
+          </wp:inline>
+        </w:drawing>
+      </w:r>
+    </w:p>
+    <w:p>
+      <w:pPr>
+        <w:rPr>
+          <w:lang w:val="en-NZ" w:eastAsia="en-NZ"/>
+        </w:rPr>
+      </w:pPr>
+      <w:r>
+        <w:rPr>
+          <w:lang w:val="en-NZ" w:eastAsia="en-NZ"/>
+        </w:rPr>
+        <w:lastRenderedPageBreak/>
+        <w:drawing>
+          <wp:inline distT="0" distB="0" distL="0" distR="0" wp14:anchorId="6D9C1CF5" wp14:editId="3F1D3B66">
+            <wp:extent cx="5731510" cy="2859405"/>
+            <wp:effectExtent l="0" t="0" r="2540" b="0"/>
+            <wp:docPr id="1142152707" name="Picture 1"/>
+            <wp:cNvGraphicFramePr>
+              <a:graphicFrameLocks xmlns:a="http://schemas.openxmlformats.org/drawingml/2006/main" noChangeAspect="1"/>
+            </wp:cNvGraphicFramePr>
+            <a:graphic xmlns:a="http://schemas.openxmlformats.org/drawingml/2006/main">
+              <a:graphicData uri="http://schemas.openxmlformats.org/drawingml/2006/picture">
+                <pic:pic xmlns:pic="http://schemas.openxmlformats.org/drawingml/2006/picture">
+                  <pic:nvPicPr>
+                    <pic:cNvPr id="1142152707" name=""/>
+                    <pic:cNvPicPr/>
+                  </pic:nvPicPr>
+                  <pic:blipFill>
+                    <a:blip r:embed="rId40"/>
+                    <a:stretch>
+                      <a:fillRect/>
+                    </a:stretch>
+                  </pic:blipFill>
+                  <pic:spPr>
+                    <a:xfrm>
+                      <a:off x="0" y="0"/>
+                      <a:ext cx="5731510" cy="2859405"/>
+                    </a:xfrm>
+                    <a:prstGeom prst="rect">
+                      <a:avLst/>
+                    </a:prstGeom>
+                  </pic:spPr>
+                </pic:pic>
+              </a:graphicData>
+            </a:graphic>
+          </wp:inline>
+        </w:drawing>
+      </w:r>
+    </w:p>
+    <w:p>
+      <w:pPr>
+        <w:rPr>
+          <w:lang w:val="en-NZ" w:eastAsia="en-NZ"/>
+        </w:rPr>
+      </w:pPr>
+      <w:r>
+        <w:rPr>
+          <w:lang w:val="en-NZ" w:eastAsia="en-NZ"/>
+        </w:rPr>
+        <w:drawing>
+          <wp:inline distT="0" distB="0" distL="0" distR="0" wp14:anchorId="1E8E64C0" wp14:editId="196142FB">
+            <wp:extent cx="5731510" cy="321310"/>
+            <wp:effectExtent l="0" t="0" r="2540" b="2540"/>
+            <wp:docPr id="1227211607" name="Picture 1"/>
+            <wp:cNvGraphicFramePr>
+              <a:graphicFrameLocks xmlns:a="http://schemas.openxmlformats.org/drawingml/2006/main" noChangeAspect="1"/>
+            </wp:cNvGraphicFramePr>
+            <a:graphic xmlns:a="http://schemas.openxmlformats.org/drawingml/2006/main">
+              <a:graphicData uri="http://schemas.openxmlformats.org/drawingml/2006/picture">
+                <pic:pic xmlns:pic="http://schemas.openxmlformats.org/drawingml/2006/picture">
+                  <pic:nvPicPr>
+                    <pic:cNvPr id="1227211607" name=""/>
+                    <pic:cNvPicPr/>
+                  </pic:nvPicPr>
+                  <pic:blipFill>
+                    <a:blip r:embed="rId41"/>
+                    <a:stretch>
+                      <a:fillRect/>
+                    </a:stretch>
+                  </pic:blipFill>
+                  <pic:spPr>
+                    <a:xfrm>
+                      <a:off x="0" y="0"/>
+                      <a:ext cx="5731510" cy="321310"/>
+                    </a:xfrm>
+                    <a:prstGeom prst="rect">
+                      <a:avLst/>
+                    </a:prstGeom>
+                  </pic:spPr>
+                </pic:pic>
+              </a:graphicData>
+            </a:graphic>
+          </wp:inline>
+        </w:drawing>
+      </w:r>
+    </w:p>
+    <w:p>
+      <w:pPr>
+        <w:rPr>
+          <w:lang w:val="en-NZ" w:eastAsia="en-NZ"/>
+        </w:rPr>
+      </w:pPr>
+      <w:r>
+        <w:rPr>
+          <w:lang w:val="en-NZ" w:eastAsia="en-NZ"/>
+        </w:rPr>
+        <w:drawing>
+          <wp:inline distT="0" distB="0" distL="0" distR="0" wp14:anchorId="676BE255" wp14:editId="6F75EBEA">
+            <wp:extent cx="5731510" cy="2870200"/>
+            <wp:effectExtent l="0" t="0" r="2540" b="6350"/>
+            <wp:docPr id="1727781958" name="Picture 1"/>
+            <wp:cNvGraphicFramePr>
+              <a:graphicFrameLocks xmlns:a="http://schemas.openxmlformats.org/drawingml/2006/main" noChangeAspect="1"/>
+            </wp:cNvGraphicFramePr>
+            <a:graphic xmlns:a="http://schemas.openxmlformats.org/drawingml/2006/main">
+              <a:graphicData uri="http://schemas.openxmlformats.org/drawingml/2006/picture">
+                <pic:pic xmlns:pic="http://schemas.openxmlformats.org/drawingml/2006/picture">
+                  <pic:nvPicPr>
+                    <pic:cNvPr id="1727781958" name=""/>
+                    <pic:cNvPicPr/>
+                  </pic:nvPicPr>
+                  <pic:blipFill>
+                    <a:blip r:embed="rId42"/>
+                    <a:stretch>
+                      <a:fillRect/>
+                    </a:stretch>
+                  </pic:blipFill>
+                  <pic:spPr>
+                    <a:xfrm>
+                      <a:off x="0" y="0"/>
+                      <a:ext cx="5731510" cy="2870200"/>
+                    </a:xfrm>
+                    <a:prstGeom prst="rect">
+                      <a:avLst/>
+                    </a:prstGeom>
+                  </pic:spPr>
+                </pic:pic>
+              </a:graphicData>
+            </a:graphic>
+          </wp:inline>
+        </w:drawing>
+      </w:r>
+    </w:p>
+    <w:p>
+      <w:pPr>
+        <w:rPr>
+          <w:lang w:val="en-NZ" w:eastAsia="en-NZ"/>
+        </w:rPr>
+      </w:pPr>
+      <w:r>
+        <w:rPr>
+          <w:lang w:val="en-NZ" w:eastAsia="en-NZ"/>
+        </w:rPr>
+        <w:lastRenderedPageBreak/>
+        <w:drawing>
+          <wp:inline distT="0" distB="0" distL="0" distR="0" wp14:anchorId="0570B4F5" wp14:editId="3C12106D">
+            <wp:extent cx="5731510" cy="2914650"/>
+            <wp:effectExtent l="0" t="0" r="2540" b="0"/>
+            <wp:docPr id="1507788585" name="Picture 1"/>
+            <wp:cNvGraphicFramePr>
+              <a:graphicFrameLocks xmlns:a="http://schemas.openxmlformats.org/drawingml/2006/main" noChangeAspect="1"/>
+            </wp:cNvGraphicFramePr>
+            <a:graphic xmlns:a="http://schemas.openxmlformats.org/drawingml/2006/main">
+              <a:graphicData uri="http://schemas.openxmlformats.org/drawingml/2006/picture">
+                <pic:pic xmlns:pic="http://schemas.openxmlformats.org/drawingml/2006/picture">
+                  <pic:nvPicPr>
+                    <pic:cNvPr id="1507788585" name=""/>
+                    <pic:cNvPicPr/>
+                  </pic:nvPicPr>
+                  <pic:blipFill>
+                    <a:blip r:embed="rId43"/>
+                    <a:stretch>
+                      <a:fillRect/>
+                    </a:stretch>
+                  </pic:blipFill>
+                  <pic:spPr>
+                    <a:xfrm>
+                      <a:off x="0" y="0"/>
+                      <a:ext cx="5731510" cy="2914650"/>
+                    </a:xfrm>
+                    <a:prstGeom prst="rect">
+                      <a:avLst/>
+                    </a:prstGeom>
+                  </pic:spPr>
+                </pic:pic>
+              </a:graphicData>
+            </a:graphic>
+          </wp:inline>
+        </w:drawing>
+      </w:r>
+    </w:p>
+    <w:p>
+      <w:pPr>
+        <w:rPr>
+          <w:lang w:val="en-NZ" w:eastAsia="en-NZ"/>
+        </w:rPr>
+      </w:pPr>
+      <w:r>
+        <w:rPr>
+          <w:lang w:val="en-NZ" w:eastAsia="en-NZ"/>
+        </w:rPr>
+        <w:drawing>
+          <wp:inline distT="0" distB="0" distL="0" distR="0" wp14:anchorId="644B5F5B" wp14:editId="163A9759">
+            <wp:extent cx="5731510" cy="1207770"/>
+            <wp:effectExtent l="0" t="0" r="2540" b="0"/>
+            <wp:docPr id="1151042905" name="Picture 1"/>
+            <wp:cNvGraphicFramePr>
+              <a:graphicFrameLocks xmlns:a="http://schemas.openxmlformats.org/drawingml/2006/main" noChangeAspect="1"/>
+            </wp:cNvGraphicFramePr>
+            <a:graphic xmlns:a="http://schemas.openxmlformats.org/drawingml/2006/main">
+              <a:graphicData uri="http://schemas.openxmlformats.org/drawingml/2006/picture">
+                <pic:pic xmlns:pic="http://schemas.openxmlformats.org/drawingml/2006/picture">
+                  <pic:nvPicPr>
+                    <pic:cNvPr id="1151042905" name=""/>
+                    <pic:cNvPicPr/>
+                  </pic:nvPicPr>
+                  <pic:blipFill>
+                    <a:blip r:embed="rId44"/>
+                    <a:stretch>
+                      <a:fillRect/>
+                    </a:stretch>
+                  </pic:blipFill>
+                  <pic:spPr>
+                    <a:xfrm>
+                      <a:off x="0" y="0"/>
+                      <a:ext cx="5731510" cy="1207770"/>
+                    </a:xfrm>
+                    <a:prstGeom prst="rect">
+                      <a:avLst/>
+                    </a:prstGeom>
+                  </pic:spPr>
+                </pic:pic>
+              </a:graphicData>
+            </a:graphic>
+          </wp:inline>
+        </w:drawing>
+      </w:r>
     </w:p>
     <w:p>
       <w:pPr>
@@ -5000,13 +5868,193 @@
           <w:lang w:val="en-NZ" w:eastAsia="en-NZ"/>
         </w:rPr>
       </w:pPr>
-    </w:p>
-    <w:p>
-      <w:pPr>
-        <w:rPr>
-          <w:lang w:val="en-NZ" w:eastAsia="en-NZ"/>
-        </w:rPr>
-      </w:pPr>
+      <w:r>
+        <w:rPr>
+          <w:lang w:val="en-NZ" w:eastAsia="en-NZ"/>
+        </w:rPr>
+        <w:t>After realising that the queries and tables were hard to read, I added formatting</w:t>
+      </w:r>
+      <w:r>
+        <w:rPr>
+          <w:lang w:val="en-NZ" w:eastAsia="en-NZ"/>
+        </w:rPr>
+        <w:t>.</w:t>
+      </w:r>
+    </w:p>
+    <w:p>
+      <w:pPr>
+        <w:rPr>
+          <w:lang w:val="en-NZ" w:eastAsia="en-NZ"/>
+        </w:rPr>
+      </w:pPr>
+      <w:r>
+        <w:rPr>
+          <w:lang w:val="en-NZ" w:eastAsia="en-NZ"/>
+        </w:rPr>
+        <w:t>Before</w:t>
+      </w:r>
+    </w:p>
+    <w:p>
+      <w:pPr>
+        <w:rPr>
+          <w:lang w:val="en-NZ" w:eastAsia="en-NZ"/>
+        </w:rPr>
+      </w:pPr>
+      <w:r>
+        <w:rPr>
+          <w:lang w:val="en-NZ" w:eastAsia="en-NZ"/>
+        </w:rPr>
+        <w:drawing>
+          <wp:inline distT="0" distB="0" distL="0" distR="0" wp14:anchorId="10830921" wp14:editId="33F35A51">
+            <wp:extent cx="5731510" cy="1004570"/>
+            <wp:effectExtent l="0" t="0" r="2540" b="5080"/>
+            <wp:docPr id="162093541" name="Picture 1"/>
+            <wp:cNvGraphicFramePr>
+              <a:graphicFrameLocks xmlns:a="http://schemas.openxmlformats.org/drawingml/2006/main" noChangeAspect="1"/>
+            </wp:cNvGraphicFramePr>
+            <a:graphic xmlns:a="http://schemas.openxmlformats.org/drawingml/2006/main">
+              <a:graphicData uri="http://schemas.openxmlformats.org/drawingml/2006/picture">
+                <pic:pic xmlns:pic="http://schemas.openxmlformats.org/drawingml/2006/picture">
+                  <pic:nvPicPr>
+                    <pic:cNvPr id="162093541" name=""/>
+                    <pic:cNvPicPr/>
+                  </pic:nvPicPr>
+                  <pic:blipFill>
+                    <a:blip r:embed="rId45"/>
+                    <a:stretch>
+                      <a:fillRect/>
+                    </a:stretch>
+                  </pic:blipFill>
+                  <pic:spPr>
+                    <a:xfrm>
+                      <a:off x="0" y="0"/>
+                      <a:ext cx="5731510" cy="1004570"/>
+                    </a:xfrm>
+                    <a:prstGeom prst="rect">
+                      <a:avLst/>
+                    </a:prstGeom>
+                  </pic:spPr>
+                </pic:pic>
+              </a:graphicData>
+            </a:graphic>
+          </wp:inline>
+        </w:drawing>
+      </w:r>
+    </w:p>
+    <w:p>
+      <w:pPr>
+        <w:rPr>
+          <w:lang w:val="en-NZ" w:eastAsia="en-NZ"/>
+        </w:rPr>
+      </w:pPr>
+      <w:r>
+        <w:rPr>
+          <w:lang w:val="en-NZ" w:eastAsia="en-NZ"/>
+        </w:rPr>
+        <w:drawing>
+          <wp:inline distT="0" distB="0" distL="0" distR="0" wp14:anchorId="2D4C1206" wp14:editId="3D225599">
+            <wp:extent cx="5731510" cy="1030605"/>
+            <wp:effectExtent l="0" t="0" r="2540" b="0"/>
+            <wp:docPr id="836705909" name="Picture 1"/>
+            <wp:cNvGraphicFramePr>
+              <a:graphicFrameLocks xmlns:a="http://schemas.openxmlformats.org/drawingml/2006/main" noChangeAspect="1"/>
+            </wp:cNvGraphicFramePr>
+            <a:graphic xmlns:a="http://schemas.openxmlformats.org/drawingml/2006/main">
+              <a:graphicData uri="http://schemas.openxmlformats.org/drawingml/2006/picture">
+                <pic:pic xmlns:pic="http://schemas.openxmlformats.org/drawingml/2006/picture">
+                  <pic:nvPicPr>
+                    <pic:cNvPr id="836705909" name=""/>
+                    <pic:cNvPicPr/>
+                  </pic:nvPicPr>
+                  <pic:blipFill>
+                    <a:blip r:embed="rId46"/>
+                    <a:stretch>
+                      <a:fillRect/>
+                    </a:stretch>
+                  </pic:blipFill>
+                  <pic:spPr>
+                    <a:xfrm>
+                      <a:off x="0" y="0"/>
+                      <a:ext cx="5731510" cy="1030605"/>
+                    </a:xfrm>
+                    <a:prstGeom prst="rect">
+                      <a:avLst/>
+                    </a:prstGeom>
+                  </pic:spPr>
+                </pic:pic>
+              </a:graphicData>
+            </a:graphic>
+          </wp:inline>
+        </w:drawing>
+      </w:r>
+    </w:p>
+    <w:p>
+      <w:pPr>
+        <w:rPr>
+          <w:lang w:val="en-NZ" w:eastAsia="en-NZ"/>
+        </w:rPr>
+      </w:pPr>
+      <w:r>
+        <w:rPr>
+          <w:lang w:val="en-NZ" w:eastAsia="en-NZ"/>
+        </w:rPr>
+        <w:t xml:space="preserve">After </w:t>
+      </w:r>
+    </w:p>
+    <w:p>
+      <w:pPr>
+        <w:rPr>
+          <w:lang w:val="en-NZ" w:eastAsia="en-NZ"/>
+        </w:rPr>
+      </w:pPr>
+    </w:p>
+    <w:p>
+      <w:pPr>
+        <w:rPr>
+          <w:lang w:val="en-NZ" w:eastAsia="en-NZ"/>
+        </w:rPr>
+      </w:pPr>
+      <w:r>
+        <w:rPr>
+          <w:lang w:val="en-NZ" w:eastAsia="en-NZ"/>
+        </w:rPr>
+        <w:lastRenderedPageBreak/>
+        <w:drawing>
+          <wp:inline distT="0" distB="0" distL="0" distR="0" wp14:anchorId="4D58EE59" wp14:editId="2B212E75">
+            <wp:extent cx="5731510" cy="1144905"/>
+            <wp:effectExtent l="0" t="0" r="2540" b="0"/>
+            <wp:docPr id="203158875" name="Picture 1"/>
+            <wp:cNvGraphicFramePr>
+              <a:graphicFrameLocks xmlns:a="http://schemas.openxmlformats.org/drawingml/2006/main" noChangeAspect="1"/>
+            </wp:cNvGraphicFramePr>
+            <a:graphic xmlns:a="http://schemas.openxmlformats.org/drawingml/2006/main">
+              <a:graphicData uri="http://schemas.openxmlformats.org/drawingml/2006/picture">
+                <pic:pic xmlns:pic="http://schemas.openxmlformats.org/drawingml/2006/picture">
+                  <pic:nvPicPr>
+                    <pic:cNvPr id="203158875" name=""/>
+                    <pic:cNvPicPr/>
+                  </pic:nvPicPr>
+                  <pic:blipFill>
+                    <a:blip r:embed="rId47"/>
+                    <a:stretch>
+                      <a:fillRect/>
+                    </a:stretch>
+                  </pic:blipFill>
+                  <pic:spPr>
+                    <a:xfrm>
+                      <a:off x="0" y="0"/>
+                      <a:ext cx="5731510" cy="1144905"/>
+                    </a:xfrm>
+                    <a:prstGeom prst="rect">
+                      <a:avLst/>
+                    </a:prstGeom>
+                  </pic:spPr>
+                </pic:pic>
+              </a:graphicData>
+            </a:graphic>
+          </wp:inline>
+        </w:drawing>
+      </w:r>
     </w:p>
     <w:p>
       <w:pPr>
@@ -5184,6 +6232,12 @@
           <w:lang w:val="en-NZ" w:eastAsia="en-NZ"/>
         </w:rPr>
       </w:pPr>
+      <w:r>
+        <w:rPr>
+          <w:lang w:val="en-NZ" w:eastAsia="en-NZ"/>
+        </w:rPr>
+        <w:t>Refer to other assignment</w:t>
+      </w:r>
     </w:p>
     <w:p>
       <w:pPr>
@@ -5247,13 +6301,169 @@
           <w:lang w:val="en-NZ" w:eastAsia="en-NZ"/>
         </w:rPr>
       </w:pPr>
-    </w:p>
-    <w:p>
-      <w:pPr>
-        <w:rPr>
-          <w:lang w:val="en-NZ" w:eastAsia="en-NZ"/>
-        </w:rPr>
-      </w:pPr>
+      <w:r>
+        <w:rPr>
+          <w:lang w:val="en-NZ" w:eastAsia="en-NZ"/>
+        </w:rPr>
+        <w:t xml:space="preserve">Feedback – When I asked my dad to test the program, </w:t>
+      </w:r>
+      <w:r>
+        <w:rPr>
+          <w:lang w:val="en-NZ" w:eastAsia="en-NZ"/>
+        </w:rPr>
+        <w:t>he said the tables were hard to read. This was due to the lack of titles and distinctions between the columns.</w:t>
+      </w:r>
+    </w:p>
+    <w:p>
+      <w:pPr>
+        <w:rPr>
+          <w:lang w:val="en-NZ" w:eastAsia="en-NZ"/>
+        </w:rPr>
+      </w:pPr>
+      <w:r>
+        <w:rPr>
+          <w:lang w:val="en-NZ" w:eastAsia="en-NZ"/>
+        </w:rPr>
+        <w:t xml:space="preserve">Change </w:t>
+      </w:r>
+      <w:r>
+        <w:rPr>
+          <w:lang w:val="en-NZ" w:eastAsia="en-NZ"/>
+        </w:rPr>
+        <w:t>–</w:t>
+      </w:r>
+      <w:r>
+        <w:rPr>
+          <w:lang w:val="en-NZ" w:eastAsia="en-NZ"/>
+        </w:rPr>
+        <w:t xml:space="preserve"> </w:t>
+      </w:r>
+      <w:r>
+        <w:rPr>
+          <w:lang w:val="en-NZ" w:eastAsia="en-NZ"/>
+        </w:rPr>
+        <w:t>I added formatting to both queries and tables.</w:t>
+      </w:r>
+    </w:p>
+    <w:p>
+      <w:pPr>
+        <w:rPr>
+          <w:lang w:val="en-NZ" w:eastAsia="en-NZ"/>
+        </w:rPr>
+      </w:pPr>
+      <w:r>
+        <w:rPr>
+          <w:lang w:val="en-NZ" w:eastAsia="en-NZ"/>
+        </w:rPr>
+        <w:t>Before</w:t>
+      </w:r>
+    </w:p>
+    <w:p>
+      <w:pPr>
+        <w:rPr>
+          <w:lang w:val="en-NZ" w:eastAsia="en-NZ"/>
+        </w:rPr>
+      </w:pPr>
+      <w:r>
+        <w:rPr>
+          <w:lang w:val="en-NZ" w:eastAsia="en-NZ"/>
+        </w:rPr>
+        <w:drawing>
+          <wp:inline distT="0" distB="0" distL="0" distR="0" wp14:anchorId="3DCD5EFA" wp14:editId="624285E9">
+            <wp:extent cx="5543550" cy="2901980"/>
+            <wp:effectExtent l="0" t="0" r="0" b="0"/>
+            <wp:docPr id="80535707" name="Picture 1"/>
+            <wp:cNvGraphicFramePr>
+              <a:graphicFrameLocks xmlns:a="http://schemas.openxmlformats.org/drawingml/2006/main" noChangeAspect="1"/>
+            </wp:cNvGraphicFramePr>
+            <a:graphic xmlns:a="http://schemas.openxmlformats.org/drawingml/2006/main">
+              <a:graphicData uri="http://schemas.openxmlformats.org/drawingml/2006/picture">
+                <pic:pic xmlns:pic="http://schemas.openxmlformats.org/drawingml/2006/picture">
+                  <pic:nvPicPr>
+                    <pic:cNvPr id="80535707" name=""/>
+                    <pic:cNvPicPr/>
+                  </pic:nvPicPr>
+                  <pic:blipFill>
+                    <a:blip r:embed="rId48"/>
+                    <a:stretch>
+                      <a:fillRect/>
+                    </a:stretch>
+                  </pic:blipFill>
+                  <pic:spPr>
+                    <a:xfrm>
+                      <a:off x="0" y="0"/>
+                      <a:ext cx="5551134" cy="2905950"/>
+                    </a:xfrm>
+                    <a:prstGeom prst="rect">
+                      <a:avLst/>
+                    </a:prstGeom>
+                  </pic:spPr>
+                </pic:pic>
+              </a:graphicData>
+            </a:graphic>
+          </wp:inline>
+        </w:drawing>
+      </w:r>
+    </w:p>
+    <w:p>
+      <w:pPr>
+        <w:rPr>
+          <w:lang w:val="en-NZ" w:eastAsia="en-NZ"/>
+        </w:rPr>
+      </w:pPr>
+      <w:r>
+        <w:rPr>
+          <w:lang w:val="en-NZ" w:eastAsia="en-NZ"/>
+        </w:rPr>
+        <w:t>After</w:t>
+      </w:r>
+    </w:p>
+    <w:p>
+      <w:pPr>
+        <w:rPr>
+          <w:lang w:val="en-NZ" w:eastAsia="en-NZ"/>
+        </w:rPr>
+      </w:pPr>
+      <w:r>
+        <w:rPr>
+          <w:lang w:val="en-NZ" w:eastAsia="en-NZ"/>
+        </w:rPr>
+        <w:drawing>
+          <wp:inline distT="0" distB="0" distL="0" distR="0" wp14:anchorId="27EB1332" wp14:editId="35ED2055">
+            <wp:extent cx="5585261" cy="2813050"/>
+            <wp:effectExtent l="0" t="0" r="0" b="6350"/>
+            <wp:docPr id="949229026" name="Picture 1"/>
+            <wp:cNvGraphicFramePr>
+              <a:graphicFrameLocks xmlns:a="http://schemas.openxmlformats.org/drawingml/2006/main" noChangeAspect="1"/>
+            </wp:cNvGraphicFramePr>
+            <a:graphic xmlns:a="http://schemas.openxmlformats.org/drawingml/2006/main">
+              <a:graphicData uri="http://schemas.openxmlformats.org/drawingml/2006/picture">
+                <pic:pic xmlns:pic="http://schemas.openxmlformats.org/drawingml/2006/picture">
+                  <pic:nvPicPr>
+                    <pic:cNvPr id="949229026" name=""/>
+                    <pic:cNvPicPr/>
+                  </pic:nvPicPr>
+                  <pic:blipFill>
+                    <a:blip r:embed="rId49"/>
+                    <a:stretch>
+                      <a:fillRect/>
+                    </a:stretch>
+                  </pic:blipFill>
+                  <pic:spPr>
+                    <a:xfrm>
+                      <a:off x="0" y="0"/>
+                      <a:ext cx="5611255" cy="2826142"/>
+                    </a:xfrm>
+                    <a:prstGeom prst="rect">
+                      <a:avLst/>
+                    </a:prstGeom>
+                  </pic:spPr>
+                </pic:pic>
+              </a:graphicData>
+            </a:graphic>
+          </wp:inline>
+        </w:drawing>
+      </w:r>
     </w:p>
     <w:p>
       <w:pPr>
@@ -5294,6 +6504,12 @@
           <w:lang w:val="en-NZ" w:eastAsia="en-NZ"/>
         </w:rPr>
       </w:pPr>
+      <w:r>
+        <w:rPr>
+          <w:lang w:val="en-NZ" w:eastAsia="en-NZ"/>
+        </w:rPr>
+        <w:t xml:space="preserve">Refer to other assignment </w:t>
+      </w:r>
     </w:p>
     <w:p>
       <w:pPr>
@@ -7442,10 +8658,23 @@
 </file>
 
 <file path=customXml/item1.xml><?xml version="1.0" encoding="utf-8"?>
-<b:Sources xmlns:b="http://schemas.openxmlformats.org/officeDocument/2006/bibliography" xmlns="http://schemas.openxmlformats.org/officeDocument/2006/bibliography" SelectedStyle="\APASixthEditionOfficeOnline.xsl" StyleName="APA" Version="6"/>
+<p:properties xmlns:p="http://schemas.microsoft.com/office/2006/metadata/properties" xmlns:xsi="http://www.w3.org/2001/XMLSchema-instance" xmlns:pc="http://schemas.microsoft.com/office/infopath/2007/PartnerControls">
+  <documentManagement>
+    <ReferenceId xmlns="eef22584-95ed-477f-8b51-08e32d23c53e" xsi:nil="true"/>
+  </documentManagement>
+</p:properties>
 </file>
 
 <file path=customXml/item2.xml><?xml version="1.0" encoding="utf-8"?>
+<?mso-contentType ?>
+<FormTemplates xmlns="http://schemas.microsoft.com/sharepoint/v3/contenttype/forms">
+  <Display>DocumentLibraryForm</Display>
+  <Edit>DocumentLibraryForm</Edit>
+  <New>DocumentLibraryForm</New>
+</FormTemplates>
+</file>
+
+<file path=customXml/item3.xml><?xml version="1.0" encoding="utf-8"?>
 <ct:contentTypeSchema xmlns:ct="http://schemas.microsoft.com/office/2006/metadata/contentType" xmlns:ma="http://schemas.microsoft.com/office/2006/metadata/properties/metaAttributes" ct:_="" ma:_="" ma:contentTypeName="Document" ma:contentTypeID="0x010100996EDD3AF3B48C4BB8C711B5733C39F6" ma:contentTypeVersion="8" ma:contentTypeDescription="Create a new document." ma:contentTypeScope="" ma:versionID="7877da1482023c7e2a024716cc794e3c">
   <xsd:schema xmlns:xsd="http://www.w3.org/2001/XMLSchema" xmlns:xs="http://www.w3.org/2001/XMLSchema" xmlns:p="http://schemas.microsoft.com/office/2006/metadata/properties" xmlns:ns2="eef22584-95ed-477f-8b51-08e32d23c53e" targetNamespace="http://schemas.microsoft.com/office/2006/metadata/properties" ma:root="true" ma:fieldsID="517bd48a1ce1592919b2d7c36f8fb3bc" ns2:_="">
     <xsd:import namespace="eef22584-95ed-477f-8b51-08e32d23c53e"/>
@@ -7613,32 +8842,29 @@
 </ct:contentTypeSchema>
 </file>
 
-<file path=customXml/item3.xml><?xml version="1.0" encoding="utf-8"?>
-<?mso-contentType ?>
-<FormTemplates xmlns="http://schemas.microsoft.com/sharepoint/v3/contenttype/forms">
-  <Display>DocumentLibraryForm</Display>
-  <Edit>DocumentLibraryForm</Edit>
-  <New>DocumentLibraryForm</New>
-</FormTemplates>
-</file>
-
 <file path=customXml/item4.xml><?xml version="1.0" encoding="utf-8"?>
-<p:properties xmlns:p="http://schemas.microsoft.com/office/2006/metadata/properties" xmlns:xsi="http://www.w3.org/2001/XMLSchema-instance" xmlns:pc="http://schemas.microsoft.com/office/infopath/2007/PartnerControls">
-  <documentManagement>
-    <ReferenceId xmlns="eef22584-95ed-477f-8b51-08e32d23c53e" xsi:nil="true"/>
-  </documentManagement>
-</p:properties>
+<b:Sources xmlns:b="http://schemas.openxmlformats.org/officeDocument/2006/bibliography" xmlns="http://schemas.openxmlformats.org/officeDocument/2006/bibliography" SelectedStyle="\APASixthEditionOfficeOnline.xsl" StyleName="APA" Version="6"/>
 </file>
 
 <file path=customXml/itemProps1.xml><?xml version="1.0" encoding="utf-8"?>
-<ds:datastoreItem xmlns:ds="http://schemas.openxmlformats.org/officeDocument/2006/customXml" ds:itemID="{B9F390CF-A74E-4EB5-BD54-ED10285954D8}">
+<ds:datastoreItem xmlns:ds="http://schemas.openxmlformats.org/officeDocument/2006/customXml" ds:itemID="{475DFC7A-9F3E-4A94-87BF-72BD504B2E67}">
   <ds:schemaRefs>
-    <ds:schemaRef ds:uri="http://schemas.openxmlformats.org/officeDocument/2006/bibliography"/>
+    <ds:schemaRef ds:uri="http://schemas.microsoft.com/office/2006/metadata/properties"/>
+    <ds:schemaRef ds:uri="http://schemas.microsoft.com/office/infopath/2007/PartnerControls"/>
+    <ds:schemaRef ds:uri="eef22584-95ed-477f-8b51-08e32d23c53e"/>
   </ds:schemaRefs>
 </ds:datastoreItem>
 </file>
 
 <file path=customXml/itemProps2.xml><?xml version="1.0" encoding="utf-8"?>
+<ds:datastoreItem xmlns:ds="http://schemas.openxmlformats.org/officeDocument/2006/customXml" ds:itemID="{80B60E6D-8162-4682-B39F-2AD99E9D2FEB}">
+  <ds:schemaRefs>
+    <ds:schemaRef ds:uri="http://schemas.microsoft.com/sharepoint/v3/contenttype/forms"/>
+  </ds:schemaRefs>
+</ds:datastoreItem>
+</file>
+
+<file path=customXml/itemProps3.xml><?xml version="1.0" encoding="utf-8"?>
 <ds:datastoreItem xmlns:ds="http://schemas.openxmlformats.org/officeDocument/2006/customXml" ds:itemID="{975E2EC3-F226-478B-88DA-77A0B44A31C0}">
   <ds:schemaRefs>
     <ds:schemaRef ds:uri="http://schemas.microsoft.com/office/2006/metadata/contentType"/>
@@ -7656,20 +8882,10 @@
 </ds:datastoreItem>
 </file>
 
-<file path=customXml/itemProps3.xml><?xml version="1.0" encoding="utf-8"?>
-<ds:datastoreItem xmlns:ds="http://schemas.openxmlformats.org/officeDocument/2006/customXml" ds:itemID="{80B60E6D-8162-4682-B39F-2AD99E9D2FEB}">
+<file path=customXml/itemProps4.xml><?xml version="1.0" encoding="utf-8"?>
+<ds:datastoreItem xmlns:ds="http://schemas.openxmlformats.org/officeDocument/2006/customXml" ds:itemID="{B9F390CF-A74E-4EB5-BD54-ED10285954D8}">
   <ds:schemaRefs>
-    <ds:schemaRef ds:uri="http://schemas.microsoft.com/sharepoint/v3/contenttype/forms"/>
-  </ds:schemaRefs>
-</ds:datastoreItem>
-</file>
-
-<file path=customXml/itemProps4.xml><?xml version="1.0" encoding="utf-8"?>
-<ds:datastoreItem xmlns:ds="http://schemas.openxmlformats.org/officeDocument/2006/customXml" ds:itemID="{475DFC7A-9F3E-4A94-87BF-72BD504B2E67}">
-  <ds:schemaRefs>
-    <ds:schemaRef ds:uri="http://schemas.microsoft.com/office/2006/metadata/properties"/>
-    <ds:schemaRef ds:uri="http://schemas.microsoft.com/office/infopath/2007/PartnerControls"/>
-    <ds:schemaRef ds:uri="eef22584-95ed-477f-8b51-08e32d23c53e"/>
+    <ds:schemaRef ds:uri="http://schemas.openxmlformats.org/officeDocument/2006/bibliography"/>
   </ds:schemaRefs>
 </ds:datastoreItem>
 </file>
</xml_diff>